<commit_message>
Remove tikzbase.sty and zhabstract.tex files to clean up unused resources and streamline the project structure.
</commit_message>
<xml_diff>
--- a/2026-原始版本/2-学位论文格式（博士）（页眉部分只保留第几章的信息，2026版）.docx
+++ b/2026-原始版本/2-学位论文格式（博士）（页眉部分只保留第几章的信息，2026版）.docx
@@ -35,47 +35,525 @@
       <w:pPr>
         <w:spacing w:line="300" w:lineRule="auto"/>
         <w:rPr>
+          <w:rFonts w:ascii="黑体" w:eastAsia="黑体"/>
+          <w:sz w:val="24"/>
+        </w:rPr>
+      </w:pPr>
+      <w:r>
+        <w:rPr>
           <w:rFonts w:ascii="黑体" w:eastAsia="黑体" w:hint="eastAsia"/>
           <w:sz w:val="24"/>
         </w:rPr>
+        <w:t>1. 引言</w:t>
+      </w:r>
+    </w:p>
+    <w:p>
+      <w:pPr>
+        <w:spacing w:line="300" w:lineRule="auto"/>
+        <w:ind w:firstLineChars="200" w:firstLine="420"/>
+      </w:pPr>
+      <w:r>
+        <w:rPr>
+          <w:rFonts w:hint="eastAsia"/>
+        </w:rPr>
+        <w:t>依据中华人民共和国《科学技术报告、学位论文和学术论文的编写格式》和东北大学学位论文格式改编，专为我校申请硕士、博士学位人员撰写打印学位论文时使用。本格式自发布日起实行。</w:t>
+      </w:r>
+    </w:p>
+    <w:p>
+      <w:pPr>
+        <w:spacing w:line="300" w:lineRule="auto"/>
+        <w:rPr>
+          <w:rFonts w:ascii="黑体" w:eastAsia="黑体"/>
+          <w:sz w:val="24"/>
+        </w:rPr>
       </w:pPr>
       <w:r>
         <w:rPr>
           <w:rFonts w:ascii="黑体" w:eastAsia="黑体" w:hint="eastAsia"/>
           <w:sz w:val="24"/>
         </w:rPr>
-        <w:t>1. 引言</w:t>
+        <w:t>2. 学位论文主要部分</w:t>
       </w:r>
     </w:p>
     <w:p>
       <w:pPr>
         <w:spacing w:line="300" w:lineRule="auto"/>
         <w:ind w:firstLineChars="200" w:firstLine="420"/>
-        <w:rPr>
-          <w:rFonts w:hint="eastAsia"/>
-        </w:rPr>
-      </w:pPr>
-      <w:r>
-        <w:rPr>
-          <w:rFonts w:hint="eastAsia"/>
-        </w:rPr>
-        <w:t>依据中华人民共和国《科学技术报告、学位论文和学术论文的编写格式》和东北大学学位论文格式改编，专为我校申请硕士、博士学位人员撰写打印学位论文时使用。本格式自发布日起实行。</w:t>
-      </w:r>
-    </w:p>
-    <w:p>
-      <w:pPr>
-        <w:spacing w:line="300" w:lineRule="auto"/>
+      </w:pPr>
+      <w:r>
+        <w:rPr>
+          <w:rFonts w:hint="eastAsia"/>
+        </w:rPr>
+        <w:t>学位论文主要部分由前头部分、主体部分和结尾部分组成。</w:t>
+      </w:r>
+    </w:p>
+    <w:p>
+      <w:pPr>
+        <w:spacing w:line="300" w:lineRule="auto"/>
+        <w:ind w:firstLine="420"/>
+        <w:rPr>
+          <w:rFonts w:ascii="黑体" w:eastAsia="黑体" w:hAnsi="黑体" w:hint="eastAsia"/>
+        </w:rPr>
+      </w:pPr>
+      <w:r>
+        <w:rPr>
+          <w:rFonts w:ascii="黑体" w:eastAsia="黑体" w:hAnsi="黑体" w:hint="eastAsia"/>
+        </w:rPr>
+        <w:t xml:space="preserve">2.1 前头部分 </w:t>
+      </w:r>
+    </w:p>
+    <w:p>
+      <w:pPr>
+        <w:spacing w:line="300" w:lineRule="auto"/>
+        <w:ind w:firstLineChars="200" w:firstLine="420"/>
+      </w:pPr>
+      <w:r>
+        <w:rPr>
+          <w:rFonts w:hint="eastAsia"/>
+        </w:rPr>
+        <w:t>（</w:t>
+      </w:r>
+      <w:r>
+        <w:rPr>
+          <w:rFonts w:hint="eastAsia"/>
+        </w:rPr>
+        <w:t>1</w:t>
+      </w:r>
+      <w:r>
+        <w:rPr>
+          <w:rFonts w:hint="eastAsia"/>
+        </w:rPr>
+        <w:t>）封面</w:t>
+      </w:r>
+    </w:p>
+    <w:p>
+      <w:pPr>
+        <w:spacing w:line="300" w:lineRule="auto"/>
+        <w:ind w:firstLineChars="200" w:firstLine="420"/>
+      </w:pPr>
+      <w:r>
+        <w:rPr>
+          <w:rFonts w:hint="eastAsia"/>
+        </w:rPr>
+        <w:t>（</w:t>
+      </w:r>
+      <w:r>
+        <w:rPr>
+          <w:rFonts w:hint="eastAsia"/>
+        </w:rPr>
+        <w:t>2</w:t>
+      </w:r>
+      <w:r>
+        <w:rPr>
+          <w:rFonts w:hint="eastAsia"/>
+        </w:rPr>
+        <w:t>）扉页——题名页（中、英两种）</w:t>
+      </w:r>
+    </w:p>
+    <w:p>
+      <w:pPr>
+        <w:spacing w:line="300" w:lineRule="auto"/>
+        <w:ind w:firstLineChars="200" w:firstLine="420"/>
+      </w:pPr>
+      <w:r>
+        <w:rPr>
+          <w:rFonts w:hint="eastAsia"/>
+        </w:rPr>
+        <w:t>（</w:t>
+      </w:r>
+      <w:r>
+        <w:rPr>
+          <w:rFonts w:hint="eastAsia"/>
+        </w:rPr>
+        <w:t>4</w:t>
+      </w:r>
+      <w:r>
+        <w:rPr>
+          <w:rFonts w:hint="eastAsia"/>
+        </w:rPr>
+        <w:t>）声明（独创性声明）</w:t>
+      </w:r>
+    </w:p>
+    <w:p>
+      <w:pPr>
+        <w:spacing w:line="300" w:lineRule="auto"/>
+        <w:ind w:firstLineChars="200" w:firstLine="420"/>
+      </w:pPr>
+      <w:r>
+        <w:rPr>
+          <w:rFonts w:hint="eastAsia"/>
+        </w:rPr>
+        <w:t>（</w:t>
+      </w:r>
+      <w:r>
+        <w:rPr>
+          <w:rFonts w:hint="eastAsia"/>
+        </w:rPr>
+        <w:t>3</w:t>
+      </w:r>
+      <w:r>
+        <w:rPr>
+          <w:rFonts w:hint="eastAsia"/>
+        </w:rPr>
+        <w:t>）摘要（中、英两种文字）</w:t>
+      </w:r>
+    </w:p>
+    <w:p>
+      <w:pPr>
+        <w:spacing w:line="300" w:lineRule="auto"/>
+        <w:ind w:firstLineChars="200" w:firstLine="420"/>
+      </w:pPr>
+      <w:r>
+        <w:rPr>
+          <w:rFonts w:hint="eastAsia"/>
+        </w:rPr>
+        <w:t>（</w:t>
+      </w:r>
+      <w:r>
+        <w:rPr>
+          <w:rFonts w:hint="eastAsia"/>
+        </w:rPr>
+        <w:t>5</w:t>
+      </w:r>
+      <w:r>
+        <w:rPr>
+          <w:rFonts w:hint="eastAsia"/>
+        </w:rPr>
+        <w:t>）目录</w:t>
+      </w:r>
+    </w:p>
+    <w:p>
+      <w:pPr>
+        <w:spacing w:line="300" w:lineRule="auto"/>
+        <w:ind w:firstLineChars="200" w:firstLine="420"/>
+      </w:pPr>
+      <w:r>
+        <w:rPr>
+          <w:rFonts w:hint="eastAsia"/>
+        </w:rPr>
+        <w:t>（</w:t>
+      </w:r>
+      <w:r>
+        <w:rPr>
+          <w:rFonts w:hint="eastAsia"/>
+        </w:rPr>
+        <w:t>6</w:t>
+      </w:r>
+      <w:r>
+        <w:rPr>
+          <w:rFonts w:hint="eastAsia"/>
+        </w:rPr>
+        <w:t>）插图和附表清单（只限必要时）</w:t>
+      </w:r>
+    </w:p>
+    <w:p>
+      <w:pPr>
+        <w:spacing w:line="300" w:lineRule="auto"/>
+        <w:ind w:firstLineChars="200" w:firstLine="420"/>
+      </w:pPr>
+      <w:r>
+        <w:rPr>
+          <w:rFonts w:hint="eastAsia"/>
+        </w:rPr>
+        <w:t>（</w:t>
+      </w:r>
+      <w:r>
+        <w:rPr>
+          <w:rFonts w:hint="eastAsia"/>
+        </w:rPr>
+        <w:t>7</w:t>
+      </w:r>
+      <w:r>
+        <w:rPr>
+          <w:rFonts w:hint="eastAsia"/>
+        </w:rPr>
+        <w:t>）缩略字、缩写词、符号、单位表（只限必要时）</w:t>
+      </w:r>
+    </w:p>
+    <w:p>
+      <w:pPr>
+        <w:spacing w:line="300" w:lineRule="auto"/>
+        <w:ind w:firstLineChars="200" w:firstLine="420"/>
+      </w:pPr>
+      <w:r>
+        <w:rPr>
+          <w:rFonts w:hint="eastAsia"/>
+        </w:rPr>
+        <w:t>（</w:t>
+      </w:r>
+      <w:r>
+        <w:rPr>
+          <w:rFonts w:hint="eastAsia"/>
+        </w:rPr>
+        <w:t>8</w:t>
+      </w:r>
+      <w:r>
+        <w:rPr>
+          <w:rFonts w:hint="eastAsia"/>
+        </w:rPr>
+        <w:t>）名词术语注释表（只限必要时）</w:t>
+      </w:r>
+    </w:p>
+    <w:p>
+      <w:pPr>
+        <w:spacing w:line="300" w:lineRule="auto"/>
+        <w:ind w:firstLine="420"/>
+        <w:rPr>
+          <w:rFonts w:ascii="黑体" w:eastAsia="黑体" w:hAnsi="黑体" w:hint="eastAsia"/>
+        </w:rPr>
+      </w:pPr>
+      <w:r>
+        <w:rPr>
+          <w:rFonts w:ascii="黑体" w:eastAsia="黑体" w:hAnsi="黑体" w:hint="eastAsia"/>
+        </w:rPr>
+        <w:t>2.2 主体部分</w:t>
+      </w:r>
+    </w:p>
+    <w:p>
+      <w:pPr>
+        <w:spacing w:line="300" w:lineRule="auto"/>
+        <w:ind w:firstLineChars="200" w:firstLine="420"/>
+      </w:pPr>
+      <w:r>
+        <w:rPr>
+          <w:rFonts w:hint="eastAsia"/>
+        </w:rPr>
+        <w:t>（</w:t>
+      </w:r>
+      <w:r>
+        <w:rPr>
+          <w:rFonts w:hint="eastAsia"/>
+        </w:rPr>
+        <w:t>1</w:t>
+      </w:r>
+      <w:r>
+        <w:rPr>
+          <w:rFonts w:hint="eastAsia"/>
+        </w:rPr>
+        <w:t>）绪论（前言、引言、绪言）</w:t>
+      </w:r>
+    </w:p>
+    <w:p>
+      <w:pPr>
+        <w:spacing w:line="300" w:lineRule="auto"/>
+        <w:ind w:firstLineChars="200" w:firstLine="420"/>
+      </w:pPr>
+      <w:r>
+        <w:rPr>
+          <w:rFonts w:hint="eastAsia"/>
+        </w:rPr>
+        <w:t>（</w:t>
+      </w:r>
+      <w:r>
+        <w:rPr>
+          <w:rFonts w:hint="eastAsia"/>
+        </w:rPr>
+        <w:t>2</w:t>
+      </w:r>
+      <w:r>
+        <w:rPr>
+          <w:rFonts w:hint="eastAsia"/>
+        </w:rPr>
+        <w:t>）正文</w:t>
+      </w:r>
+    </w:p>
+    <w:p>
+      <w:pPr>
+        <w:spacing w:line="300" w:lineRule="auto"/>
+        <w:ind w:firstLineChars="200" w:firstLine="420"/>
+      </w:pPr>
+      <w:r>
+        <w:rPr>
+          <w:rFonts w:hint="eastAsia"/>
+        </w:rPr>
+        <w:t>（</w:t>
+      </w:r>
+      <w:r>
+        <w:rPr>
+          <w:rFonts w:hint="eastAsia"/>
+        </w:rPr>
+        <w:t>3</w:t>
+      </w:r>
+      <w:r>
+        <w:rPr>
+          <w:rFonts w:hint="eastAsia"/>
+        </w:rPr>
+        <w:t>）讨论、结论和建议</w:t>
+      </w:r>
+    </w:p>
+    <w:p>
+      <w:pPr>
+        <w:spacing w:line="300" w:lineRule="auto"/>
+        <w:ind w:firstLine="420"/>
+        <w:rPr>
+          <w:rFonts w:ascii="黑体" w:eastAsia="黑体" w:hAnsi="黑体" w:hint="eastAsia"/>
+        </w:rPr>
+      </w:pPr>
+      <w:r>
+        <w:rPr>
+          <w:rFonts w:ascii="黑体" w:eastAsia="黑体" w:hAnsi="黑体" w:hint="eastAsia"/>
+        </w:rPr>
+        <w:t>2.3 结尾部分（只限必要时采用）</w:t>
+      </w:r>
+    </w:p>
+    <w:p>
+      <w:pPr>
+        <w:spacing w:line="300" w:lineRule="auto"/>
+        <w:ind w:firstLineChars="200" w:firstLine="420"/>
+      </w:pPr>
+      <w:r>
+        <w:rPr>
+          <w:rFonts w:hint="eastAsia"/>
+        </w:rPr>
+        <w:t>（</w:t>
+      </w:r>
+      <w:r>
+        <w:rPr>
+          <w:rFonts w:hint="eastAsia"/>
+        </w:rPr>
+        <w:t>1</w:t>
+      </w:r>
+      <w:r>
+        <w:rPr>
+          <w:rFonts w:hint="eastAsia"/>
+        </w:rPr>
+        <w:t>）参考文献</w:t>
+      </w:r>
+    </w:p>
+    <w:p>
+      <w:pPr>
+        <w:spacing w:line="300" w:lineRule="auto"/>
+        <w:ind w:firstLineChars="200" w:firstLine="420"/>
+      </w:pPr>
+      <w:r>
+        <w:rPr>
+          <w:rFonts w:hint="eastAsia"/>
+        </w:rPr>
+        <w:t>（</w:t>
+      </w:r>
+      <w:r>
+        <w:rPr>
+          <w:rFonts w:hint="eastAsia"/>
+        </w:rPr>
+        <w:t>2</w:t>
+      </w:r>
+      <w:r>
+        <w:rPr>
+          <w:rFonts w:hint="eastAsia"/>
+        </w:rPr>
+        <w:t>）致谢</w:t>
+      </w:r>
+    </w:p>
+    <w:p>
+      <w:pPr>
+        <w:spacing w:line="300" w:lineRule="auto"/>
+        <w:ind w:firstLineChars="200" w:firstLine="420"/>
+      </w:pPr>
+      <w:r>
+        <w:rPr>
+          <w:rFonts w:hint="eastAsia"/>
+        </w:rPr>
+        <w:t>（</w:t>
+      </w:r>
+      <w:r>
+        <w:rPr>
+          <w:rFonts w:hint="eastAsia"/>
+        </w:rPr>
+        <w:t>3</w:t>
+      </w:r>
+      <w:r>
+        <w:rPr>
+          <w:rFonts w:hint="eastAsia"/>
+        </w:rPr>
+        <w:t>）攻读博士学位期间取得的学术成果</w:t>
+      </w:r>
+    </w:p>
+    <w:p>
+      <w:pPr>
+        <w:spacing w:line="300" w:lineRule="auto"/>
+        <w:ind w:firstLineChars="200" w:firstLine="420"/>
+      </w:pPr>
+      <w:r>
+        <w:rPr>
+          <w:rFonts w:hint="eastAsia"/>
+        </w:rPr>
+        <w:t>（</w:t>
+      </w:r>
+      <w:r>
+        <w:rPr>
+          <w:rFonts w:hint="eastAsia"/>
+        </w:rPr>
+        <w:t>4</w:t>
+      </w:r>
+      <w:r>
+        <w:rPr>
+          <w:rFonts w:hint="eastAsia"/>
+        </w:rPr>
+        <w:t>）作者从事科学研究和学习经历的简历</w:t>
+      </w:r>
+    </w:p>
+    <w:p>
+      <w:pPr>
+        <w:spacing w:line="300" w:lineRule="auto"/>
+        <w:ind w:firstLineChars="200" w:firstLine="420"/>
+      </w:pPr>
+      <w:r>
+        <w:rPr>
+          <w:rFonts w:hint="eastAsia"/>
+        </w:rPr>
+        <w:t>（</w:t>
+      </w:r>
+      <w:r>
+        <w:rPr>
+          <w:rFonts w:hint="eastAsia"/>
+        </w:rPr>
+        <w:t>5</w:t>
+      </w:r>
+      <w:r>
+        <w:rPr>
+          <w:rFonts w:hint="eastAsia"/>
+        </w:rPr>
+        <w:t>）可供参考的文献题录（只限必要时采用）</w:t>
+      </w:r>
+    </w:p>
+    <w:p>
+      <w:pPr>
+        <w:spacing w:line="300" w:lineRule="auto"/>
+        <w:ind w:firstLineChars="200" w:firstLine="420"/>
+      </w:pPr>
+      <w:r>
+        <w:rPr>
+          <w:rFonts w:hint="eastAsia"/>
+        </w:rPr>
+        <w:t>（</w:t>
+      </w:r>
+      <w:r>
+        <w:rPr>
+          <w:rFonts w:hint="eastAsia"/>
+        </w:rPr>
+        <w:t>6</w:t>
+      </w:r>
+      <w:r>
+        <w:rPr>
+          <w:rFonts w:hint="eastAsia"/>
+        </w:rPr>
+        <w:t>）索引（只限必要时采用）</w:t>
+      </w:r>
+    </w:p>
+    <w:p>
+      <w:pPr>
+        <w:spacing w:line="300" w:lineRule="auto"/>
+        <w:rPr>
+          <w:rFonts w:ascii="黑体" w:eastAsia="黑体"/>
+          <w:sz w:val="24"/>
+        </w:rPr>
+      </w:pPr>
+      <w:r>
         <w:rPr>
           <w:rFonts w:ascii="黑体" w:eastAsia="黑体" w:hint="eastAsia"/>
           <w:sz w:val="24"/>
         </w:rPr>
-      </w:pPr>
-      <w:r>
-        <w:rPr>
-          <w:rFonts w:ascii="黑体" w:eastAsia="黑体" w:hint="eastAsia"/>
-          <w:sz w:val="24"/>
-        </w:rPr>
-        <w:t>2. 学位论文主要部分</w:t>
+        <w:t>3. 版式</w:t>
       </w:r>
     </w:p>
     <w:p>
@@ -87,725 +565,181 @@
         <w:rPr>
           <w:rFonts w:hint="eastAsia"/>
         </w:rPr>
-        <w:t>学位论文主要部分由前头部分、主体部分和结尾部分组成。</w:t>
-      </w:r>
-    </w:p>
-    <w:p>
-      <w:pPr>
-        <w:spacing w:line="300" w:lineRule="auto"/>
-        <w:ind w:firstLine="420"/>
-        <w:rPr>
-          <w:rFonts w:ascii="黑体" w:eastAsia="黑体" w:hAnsi="黑体" w:hint="eastAsia"/>
-        </w:rPr>
-      </w:pPr>
-      <w:r>
-        <w:rPr>
-          <w:rFonts w:ascii="黑体" w:eastAsia="黑体" w:hAnsi="黑体" w:hint="eastAsia"/>
-        </w:rPr>
-        <w:t xml:space="preserve">2.1 前头部分 </w:t>
+        <w:t>纸张大小：纸的尺寸为标准</w:t>
+      </w:r>
+      <w:r>
+        <w:rPr>
+          <w:rFonts w:hint="eastAsia"/>
+        </w:rPr>
+        <w:t>A4</w:t>
+      </w:r>
+      <w:r>
+        <w:rPr>
+          <w:rFonts w:hint="eastAsia"/>
+        </w:rPr>
+        <w:t>复印纸（</w:t>
+      </w:r>
+      <w:r>
+        <w:rPr>
+          <w:rFonts w:hint="eastAsia"/>
+        </w:rPr>
+        <w:t>210mm</w:t>
+      </w:r>
+      <w:r>
+        <w:rPr>
+          <w:rFonts w:hint="eastAsia"/>
+        </w:rPr>
+        <w:t>×</w:t>
+      </w:r>
+      <w:r>
+        <w:rPr>
+          <w:rFonts w:hint="eastAsia"/>
+        </w:rPr>
+        <w:t>297mm</w:t>
+      </w:r>
+      <w:r>
+        <w:rPr>
+          <w:rFonts w:hint="eastAsia"/>
+        </w:rPr>
+        <w:t>）。</w:t>
       </w:r>
     </w:p>
     <w:p>
       <w:pPr>
         <w:spacing w:line="300" w:lineRule="auto"/>
         <w:ind w:firstLineChars="200" w:firstLine="420"/>
-        <w:rPr>
-          <w:rFonts w:hint="eastAsia"/>
-        </w:rPr>
-      </w:pPr>
-      <w:r>
-        <w:rPr>
-          <w:rFonts w:hint="eastAsia"/>
-        </w:rPr>
-        <w:t>（</w:t>
-      </w:r>
-      <w:r>
-        <w:rPr>
-          <w:rFonts w:hint="eastAsia"/>
-        </w:rPr>
-        <w:t>1</w:t>
-      </w:r>
-      <w:r>
-        <w:rPr>
-          <w:rFonts w:hint="eastAsia"/>
-        </w:rPr>
-        <w:t>）封面</w:t>
+      </w:pPr>
+      <w:r>
+        <w:rPr>
+          <w:rFonts w:hint="eastAsia"/>
+        </w:rPr>
+        <w:t>版芯（打印尺寸）：</w:t>
+      </w:r>
+      <w:r>
+        <w:rPr>
+          <w:rFonts w:hint="eastAsia"/>
+        </w:rPr>
+        <w:t>160mm</w:t>
+      </w:r>
+      <w:r>
+        <w:rPr>
+          <w:rFonts w:hint="eastAsia"/>
+        </w:rPr>
+        <w:t>×</w:t>
+      </w:r>
+      <w:r>
+        <w:rPr>
+          <w:rFonts w:hint="eastAsia"/>
+        </w:rPr>
+        <w:t>247mm</w:t>
+      </w:r>
+      <w:r>
+        <w:rPr>
+          <w:rFonts w:hint="eastAsia"/>
+        </w:rPr>
+        <w:t>（不包括页眉行、页码行）。</w:t>
       </w:r>
     </w:p>
     <w:p>
       <w:pPr>
         <w:spacing w:line="300" w:lineRule="auto"/>
         <w:ind w:firstLineChars="200" w:firstLine="420"/>
-        <w:rPr>
-          <w:rFonts w:hint="eastAsia"/>
-        </w:rPr>
-      </w:pPr>
-      <w:r>
-        <w:rPr>
-          <w:rFonts w:hint="eastAsia"/>
-        </w:rPr>
-        <w:t>（</w:t>
-      </w:r>
-      <w:r>
-        <w:rPr>
-          <w:rFonts w:hint="eastAsia"/>
-        </w:rPr>
-        <w:t>2</w:t>
-      </w:r>
-      <w:r>
-        <w:rPr>
-          <w:rFonts w:hint="eastAsia"/>
-        </w:rPr>
-        <w:t>）扉页——题名页（中、英两种）</w:t>
+      </w:pPr>
+      <w:r>
+        <w:rPr>
+          <w:rFonts w:hint="eastAsia"/>
+        </w:rPr>
+        <w:t>正文字体字号：小</w:t>
+      </w:r>
+      <w:r>
+        <w:rPr>
+          <w:rFonts w:hint="eastAsia"/>
+        </w:rPr>
+        <w:t>4</w:t>
+      </w:r>
+      <w:r>
+        <w:rPr>
+          <w:rFonts w:hint="eastAsia"/>
+        </w:rPr>
+        <w:t>号宋体，全文统一。</w:t>
       </w:r>
     </w:p>
     <w:p>
       <w:pPr>
         <w:spacing w:line="300" w:lineRule="auto"/>
         <w:ind w:firstLineChars="200" w:firstLine="420"/>
-        <w:rPr>
-          <w:rFonts w:hint="eastAsia"/>
-        </w:rPr>
-      </w:pPr>
-      <w:r>
-        <w:rPr>
-          <w:rFonts w:hint="eastAsia"/>
-        </w:rPr>
-        <w:t>（</w:t>
-      </w:r>
-      <w:r>
-        <w:rPr>
-          <w:rFonts w:hint="eastAsia"/>
-        </w:rPr>
-        <w:t>4</w:t>
-      </w:r>
-      <w:r>
-        <w:rPr>
-          <w:rFonts w:hint="eastAsia"/>
-        </w:rPr>
-        <w:t>）声明（独创性声明）</w:t>
+      </w:pPr>
+      <w:r>
+        <w:rPr>
+          <w:rFonts w:hint="eastAsia"/>
+        </w:rPr>
+        <w:t>每页</w:t>
+      </w:r>
+      <w:r>
+        <w:rPr>
+          <w:rFonts w:hint="eastAsia"/>
+        </w:rPr>
+        <w:t>30</w:t>
+      </w:r>
+      <w:r>
+        <w:rPr>
+          <w:rFonts w:hint="eastAsia"/>
+        </w:rPr>
+        <w:t>～</w:t>
+      </w:r>
+      <w:r>
+        <w:rPr>
+          <w:rFonts w:hint="eastAsia"/>
+        </w:rPr>
+        <w:t>35</w:t>
+      </w:r>
+      <w:r>
+        <w:rPr>
+          <w:rFonts w:hint="eastAsia"/>
+        </w:rPr>
+        <w:t>行，每行</w:t>
+      </w:r>
+      <w:r>
+        <w:rPr>
+          <w:rFonts w:hint="eastAsia"/>
+        </w:rPr>
+        <w:t>35</w:t>
+      </w:r>
+      <w:r>
+        <w:rPr>
+          <w:rFonts w:hint="eastAsia"/>
+        </w:rPr>
+        <w:t>～</w:t>
+      </w:r>
+      <w:r>
+        <w:rPr>
+          <w:rFonts w:hint="eastAsia"/>
+        </w:rPr>
+        <w:t>38</w:t>
+      </w:r>
+      <w:r>
+        <w:rPr>
+          <w:rFonts w:hint="eastAsia"/>
+        </w:rPr>
+        <w:t>字。</w:t>
       </w:r>
     </w:p>
     <w:p>
       <w:pPr>
         <w:spacing w:line="300" w:lineRule="auto"/>
         <w:ind w:firstLineChars="200" w:firstLine="420"/>
-        <w:rPr>
-          <w:rFonts w:hint="eastAsia"/>
-        </w:rPr>
-      </w:pPr>
-      <w:r>
-        <w:rPr>
-          <w:rFonts w:hint="eastAsia"/>
-        </w:rPr>
-        <w:t>（</w:t>
-      </w:r>
-      <w:r>
-        <w:rPr>
-          <w:rFonts w:hint="eastAsia"/>
-        </w:rPr>
-        <w:t>3</w:t>
-      </w:r>
-      <w:r>
-        <w:rPr>
-          <w:rFonts w:hint="eastAsia"/>
-        </w:rPr>
-        <w:t>）摘要（中、英两种文字）</w:t>
+      </w:pPr>
+      <w:r>
+        <w:rPr>
+          <w:rFonts w:hint="eastAsia"/>
+        </w:rPr>
+        <w:t>装订：双面打印印刷，沿长边装订。</w:t>
       </w:r>
     </w:p>
     <w:p>
       <w:pPr>
         <w:spacing w:line="300" w:lineRule="auto"/>
         <w:ind w:firstLineChars="200" w:firstLine="420"/>
-        <w:rPr>
-          <w:rFonts w:hint="eastAsia"/>
-        </w:rPr>
-      </w:pPr>
-      <w:r>
-        <w:rPr>
-          <w:rFonts w:hint="eastAsia"/>
-        </w:rPr>
-        <w:t>（</w:t>
-      </w:r>
-      <w:r>
-        <w:rPr>
-          <w:rFonts w:hint="eastAsia"/>
-        </w:rPr>
-        <w:t>5</w:t>
-      </w:r>
-      <w:r>
-        <w:rPr>
-          <w:rFonts w:hint="eastAsia"/>
-        </w:rPr>
-        <w:t>）目录</w:t>
-      </w:r>
-    </w:p>
-    <w:p>
-      <w:pPr>
-        <w:spacing w:line="300" w:lineRule="auto"/>
-        <w:ind w:firstLineChars="200" w:firstLine="420"/>
-        <w:rPr>
-          <w:rFonts w:hint="eastAsia"/>
-        </w:rPr>
-      </w:pPr>
-      <w:r>
-        <w:rPr>
-          <w:rFonts w:hint="eastAsia"/>
-        </w:rPr>
-        <w:t>（</w:t>
-      </w:r>
-      <w:r>
-        <w:rPr>
-          <w:rFonts w:hint="eastAsia"/>
-        </w:rPr>
-        <w:t>6</w:t>
-      </w:r>
-      <w:r>
-        <w:rPr>
-          <w:rFonts w:hint="eastAsia"/>
-        </w:rPr>
-        <w:t>）插图和附表清单（只限必要时）</w:t>
-      </w:r>
-    </w:p>
-    <w:p>
-      <w:pPr>
-        <w:spacing w:line="300" w:lineRule="auto"/>
-        <w:ind w:firstLineChars="200" w:firstLine="420"/>
-        <w:rPr>
-          <w:rFonts w:hint="eastAsia"/>
-        </w:rPr>
-      </w:pPr>
-      <w:r>
-        <w:rPr>
-          <w:rFonts w:hint="eastAsia"/>
-        </w:rPr>
-        <w:t>（</w:t>
-      </w:r>
-      <w:r>
-        <w:rPr>
-          <w:rFonts w:hint="eastAsia"/>
-        </w:rPr>
-        <w:t>7</w:t>
-      </w:r>
-      <w:r>
-        <w:rPr>
-          <w:rFonts w:hint="eastAsia"/>
-        </w:rPr>
-        <w:t>）缩略字、缩写词、符号、单位表（只限必要时）</w:t>
-      </w:r>
-    </w:p>
-    <w:p>
-      <w:pPr>
-        <w:spacing w:line="300" w:lineRule="auto"/>
-        <w:ind w:firstLineChars="200" w:firstLine="420"/>
-        <w:rPr>
-          <w:rFonts w:hint="eastAsia"/>
-        </w:rPr>
-      </w:pPr>
-      <w:r>
-        <w:rPr>
-          <w:rFonts w:hint="eastAsia"/>
-        </w:rPr>
-        <w:t>（</w:t>
-      </w:r>
-      <w:r>
-        <w:rPr>
-          <w:rFonts w:hint="eastAsia"/>
-        </w:rPr>
-        <w:t>8</w:t>
-      </w:r>
-      <w:r>
-        <w:rPr>
-          <w:rFonts w:hint="eastAsia"/>
-        </w:rPr>
-        <w:t>）名词术语注释表（只限必要时）</w:t>
-      </w:r>
-    </w:p>
-    <w:p>
-      <w:pPr>
-        <w:spacing w:line="300" w:lineRule="auto"/>
-        <w:ind w:firstLine="420"/>
-        <w:rPr>
-          <w:rFonts w:ascii="黑体" w:eastAsia="黑体" w:hAnsi="黑体" w:hint="eastAsia"/>
-        </w:rPr>
-      </w:pPr>
-      <w:r>
-        <w:rPr>
-          <w:rFonts w:ascii="黑体" w:eastAsia="黑体" w:hAnsi="黑体" w:hint="eastAsia"/>
-        </w:rPr>
-        <w:t>2.2 主体部分</w:t>
-      </w:r>
-    </w:p>
-    <w:p>
-      <w:pPr>
-        <w:spacing w:line="300" w:lineRule="auto"/>
-        <w:ind w:firstLineChars="200" w:firstLine="420"/>
-        <w:rPr>
-          <w:rFonts w:hint="eastAsia"/>
-        </w:rPr>
-      </w:pPr>
-      <w:r>
-        <w:rPr>
-          <w:rFonts w:hint="eastAsia"/>
-        </w:rPr>
-        <w:t>（</w:t>
-      </w:r>
-      <w:r>
-        <w:rPr>
-          <w:rFonts w:hint="eastAsia"/>
-        </w:rPr>
-        <w:t>1</w:t>
-      </w:r>
-      <w:r>
-        <w:rPr>
-          <w:rFonts w:hint="eastAsia"/>
-        </w:rPr>
-        <w:t>）绪论（前言、引言、绪言）</w:t>
-      </w:r>
-    </w:p>
-    <w:p>
-      <w:pPr>
-        <w:spacing w:line="300" w:lineRule="auto"/>
-        <w:ind w:firstLineChars="200" w:firstLine="420"/>
-        <w:rPr>
-          <w:rFonts w:hint="eastAsia"/>
-        </w:rPr>
-      </w:pPr>
-      <w:r>
-        <w:rPr>
-          <w:rFonts w:hint="eastAsia"/>
-        </w:rPr>
-        <w:t>（</w:t>
-      </w:r>
-      <w:r>
-        <w:rPr>
-          <w:rFonts w:hint="eastAsia"/>
-        </w:rPr>
-        <w:t>2</w:t>
-      </w:r>
-      <w:r>
-        <w:rPr>
-          <w:rFonts w:hint="eastAsia"/>
-        </w:rPr>
-        <w:t>）正文</w:t>
-      </w:r>
-    </w:p>
-    <w:p>
-      <w:pPr>
-        <w:spacing w:line="300" w:lineRule="auto"/>
-        <w:ind w:firstLineChars="200" w:firstLine="420"/>
-        <w:rPr>
-          <w:rFonts w:hint="eastAsia"/>
-        </w:rPr>
-      </w:pPr>
-      <w:r>
-        <w:rPr>
-          <w:rFonts w:hint="eastAsia"/>
-        </w:rPr>
-        <w:t>（</w:t>
-      </w:r>
-      <w:r>
-        <w:rPr>
-          <w:rFonts w:hint="eastAsia"/>
-        </w:rPr>
-        <w:t>3</w:t>
-      </w:r>
-      <w:r>
-        <w:rPr>
-          <w:rFonts w:hint="eastAsia"/>
-        </w:rPr>
-        <w:t>）讨论、结论和建议</w:t>
-      </w:r>
-    </w:p>
-    <w:p>
-      <w:pPr>
-        <w:spacing w:line="300" w:lineRule="auto"/>
-        <w:ind w:firstLine="420"/>
-        <w:rPr>
-          <w:rFonts w:ascii="黑体" w:eastAsia="黑体" w:hAnsi="黑体" w:hint="eastAsia"/>
-        </w:rPr>
-      </w:pPr>
-      <w:r>
-        <w:rPr>
-          <w:rFonts w:ascii="黑体" w:eastAsia="黑体" w:hAnsi="黑体" w:hint="eastAsia"/>
-        </w:rPr>
-        <w:t>2.3 结尾部分（只限必要时采用）</w:t>
-      </w:r>
-    </w:p>
-    <w:p>
-      <w:pPr>
-        <w:spacing w:line="300" w:lineRule="auto"/>
-        <w:ind w:firstLineChars="200" w:firstLine="420"/>
-        <w:rPr>
-          <w:rFonts w:hint="eastAsia"/>
-        </w:rPr>
-      </w:pPr>
-      <w:r>
-        <w:rPr>
-          <w:rFonts w:hint="eastAsia"/>
-        </w:rPr>
-        <w:t>（</w:t>
-      </w:r>
-      <w:r>
-        <w:rPr>
-          <w:rFonts w:hint="eastAsia"/>
-        </w:rPr>
-        <w:t>1</w:t>
-      </w:r>
-      <w:r>
-        <w:rPr>
-          <w:rFonts w:hint="eastAsia"/>
-        </w:rPr>
-        <w:t>）参考文献</w:t>
-      </w:r>
-    </w:p>
-    <w:p>
-      <w:pPr>
-        <w:spacing w:line="300" w:lineRule="auto"/>
-        <w:ind w:firstLineChars="200" w:firstLine="420"/>
-        <w:rPr>
-          <w:rFonts w:hint="eastAsia"/>
-        </w:rPr>
-      </w:pPr>
-      <w:r>
-        <w:rPr>
-          <w:rFonts w:hint="eastAsia"/>
-        </w:rPr>
-        <w:t>（</w:t>
-      </w:r>
-      <w:r>
-        <w:rPr>
-          <w:rFonts w:hint="eastAsia"/>
-        </w:rPr>
-        <w:t>2</w:t>
-      </w:r>
-      <w:r>
-        <w:rPr>
-          <w:rFonts w:hint="eastAsia"/>
-        </w:rPr>
-        <w:t>）致谢</w:t>
-      </w:r>
-    </w:p>
-    <w:p>
-      <w:pPr>
-        <w:spacing w:line="300" w:lineRule="auto"/>
-        <w:ind w:firstLineChars="200" w:firstLine="420"/>
-        <w:rPr>
-          <w:rFonts w:hint="eastAsia"/>
-        </w:rPr>
-      </w:pPr>
-      <w:r>
-        <w:rPr>
-          <w:rFonts w:hint="eastAsia"/>
-        </w:rPr>
-        <w:t>（</w:t>
-      </w:r>
-      <w:r>
-        <w:rPr>
-          <w:rFonts w:hint="eastAsia"/>
-        </w:rPr>
-        <w:t>3</w:t>
-      </w:r>
-      <w:r>
-        <w:rPr>
-          <w:rFonts w:hint="eastAsia"/>
-        </w:rPr>
-        <w:t>）攻读博士学位期间取得的学术成果</w:t>
-      </w:r>
-    </w:p>
-    <w:p>
-      <w:pPr>
-        <w:spacing w:line="300" w:lineRule="auto"/>
-        <w:ind w:firstLineChars="200" w:firstLine="420"/>
-        <w:rPr>
-          <w:rFonts w:hint="eastAsia"/>
-        </w:rPr>
-      </w:pPr>
-      <w:r>
-        <w:rPr>
-          <w:rFonts w:hint="eastAsia"/>
-        </w:rPr>
-        <w:t>（</w:t>
-      </w:r>
-      <w:r>
-        <w:rPr>
-          <w:rFonts w:hint="eastAsia"/>
-        </w:rPr>
-        <w:t>4</w:t>
-      </w:r>
-      <w:r>
-        <w:rPr>
-          <w:rFonts w:hint="eastAsia"/>
-        </w:rPr>
-        <w:t>）作者从事科学研究和学习经历的简历</w:t>
-      </w:r>
-    </w:p>
-    <w:p>
-      <w:pPr>
-        <w:spacing w:line="300" w:lineRule="auto"/>
-        <w:ind w:firstLineChars="200" w:firstLine="420"/>
-        <w:rPr>
-          <w:rFonts w:hint="eastAsia"/>
-        </w:rPr>
-      </w:pPr>
-      <w:r>
-        <w:rPr>
-          <w:rFonts w:hint="eastAsia"/>
-        </w:rPr>
-        <w:t>（</w:t>
-      </w:r>
-      <w:r>
-        <w:rPr>
-          <w:rFonts w:hint="eastAsia"/>
-        </w:rPr>
-        <w:t>5</w:t>
-      </w:r>
-      <w:r>
-        <w:rPr>
-          <w:rFonts w:hint="eastAsia"/>
-        </w:rPr>
-        <w:t>）可供参考的文献题录（只限必要时采用）</w:t>
-      </w:r>
-    </w:p>
-    <w:p>
-      <w:pPr>
-        <w:spacing w:line="300" w:lineRule="auto"/>
-        <w:ind w:firstLineChars="200" w:firstLine="420"/>
-      </w:pPr>
-      <w:r>
-        <w:rPr>
-          <w:rFonts w:hint="eastAsia"/>
-        </w:rPr>
-        <w:t>（</w:t>
-      </w:r>
-      <w:r>
-        <w:rPr>
-          <w:rFonts w:hint="eastAsia"/>
-        </w:rPr>
-        <w:t>6</w:t>
-      </w:r>
-      <w:r>
-        <w:rPr>
-          <w:rFonts w:hint="eastAsia"/>
-        </w:rPr>
-        <w:t>）索引（只限必要时采用）</w:t>
-      </w:r>
-    </w:p>
-    <w:p>
-      <w:pPr>
-        <w:spacing w:line="300" w:lineRule="auto"/>
-        <w:rPr>
-          <w:rFonts w:ascii="黑体" w:eastAsia="黑体" w:hint="eastAsia"/>
-          <w:sz w:val="24"/>
-        </w:rPr>
-      </w:pPr>
-      <w:r>
-        <w:rPr>
-          <w:rFonts w:ascii="黑体" w:eastAsia="黑体" w:hint="eastAsia"/>
-          <w:sz w:val="24"/>
-        </w:rPr>
-        <w:t>3. 版式</w:t>
-      </w:r>
-    </w:p>
-    <w:p>
-      <w:pPr>
-        <w:spacing w:line="300" w:lineRule="auto"/>
-        <w:ind w:firstLineChars="200" w:firstLine="420"/>
-        <w:rPr>
-          <w:rFonts w:hint="eastAsia"/>
-        </w:rPr>
-      </w:pPr>
-      <w:r>
-        <w:rPr>
-          <w:rFonts w:hint="eastAsia"/>
-        </w:rPr>
-        <w:t>纸张大小：纸的尺寸为标准</w:t>
-      </w:r>
-      <w:r>
-        <w:rPr>
-          <w:rFonts w:hint="eastAsia"/>
-        </w:rPr>
-        <w:t>A4</w:t>
-      </w:r>
-      <w:r>
-        <w:rPr>
-          <w:rFonts w:hint="eastAsia"/>
-        </w:rPr>
-        <w:t>复印纸（</w:t>
-      </w:r>
-      <w:r>
-        <w:rPr>
-          <w:rFonts w:hint="eastAsia"/>
-        </w:rPr>
-        <w:t>210mm</w:t>
-      </w:r>
-      <w:r>
-        <w:rPr>
-          <w:rFonts w:hint="eastAsia"/>
-        </w:rPr>
-        <w:t>×</w:t>
-      </w:r>
-      <w:r>
-        <w:rPr>
-          <w:rFonts w:hint="eastAsia"/>
-        </w:rPr>
-        <w:t>297mm</w:t>
-      </w:r>
-      <w:r>
-        <w:rPr>
-          <w:rFonts w:hint="eastAsia"/>
-        </w:rPr>
-        <w:t>）。</w:t>
-      </w:r>
-    </w:p>
-    <w:p>
-      <w:pPr>
-        <w:spacing w:line="300" w:lineRule="auto"/>
-        <w:ind w:firstLineChars="200" w:firstLine="420"/>
-        <w:rPr>
-          <w:rFonts w:hint="eastAsia"/>
-        </w:rPr>
-      </w:pPr>
-      <w:r>
-        <w:rPr>
-          <w:rFonts w:hint="eastAsia"/>
-        </w:rPr>
-        <w:t>版芯（打印尺寸）：</w:t>
-      </w:r>
-      <w:r>
-        <w:rPr>
-          <w:rFonts w:hint="eastAsia"/>
-        </w:rPr>
-        <w:t>160mm</w:t>
-      </w:r>
-      <w:r>
-        <w:rPr>
-          <w:rFonts w:hint="eastAsia"/>
-        </w:rPr>
-        <w:t>×</w:t>
-      </w:r>
-      <w:r>
-        <w:rPr>
-          <w:rFonts w:hint="eastAsia"/>
-        </w:rPr>
-        <w:t>247mm</w:t>
-      </w:r>
-      <w:r>
-        <w:rPr>
-          <w:rFonts w:hint="eastAsia"/>
-        </w:rPr>
-        <w:t>（不包括页眉行、页码行）。</w:t>
-      </w:r>
-    </w:p>
-    <w:p>
-      <w:pPr>
-        <w:spacing w:line="300" w:lineRule="auto"/>
-        <w:ind w:firstLineChars="200" w:firstLine="420"/>
-        <w:rPr>
-          <w:rFonts w:hint="eastAsia"/>
-        </w:rPr>
-      </w:pPr>
-      <w:r>
-        <w:rPr>
-          <w:rFonts w:hint="eastAsia"/>
-        </w:rPr>
-        <w:t>正文字体字号：小</w:t>
-      </w:r>
-      <w:r>
-        <w:rPr>
-          <w:rFonts w:hint="eastAsia"/>
-        </w:rPr>
-        <w:t>4</w:t>
-      </w:r>
-      <w:r>
-        <w:rPr>
-          <w:rFonts w:hint="eastAsia"/>
-        </w:rPr>
-        <w:t>号宋体，全文统一。</w:t>
-      </w:r>
-    </w:p>
-    <w:p>
-      <w:pPr>
-        <w:spacing w:line="300" w:lineRule="auto"/>
-        <w:ind w:firstLineChars="200" w:firstLine="420"/>
-      </w:pPr>
-      <w:r>
-        <w:rPr>
-          <w:rFonts w:hint="eastAsia"/>
-        </w:rPr>
-        <w:t>每页</w:t>
-      </w:r>
-      <w:r>
-        <w:rPr>
-          <w:rFonts w:hint="eastAsia"/>
-        </w:rPr>
-        <w:t>30</w:t>
-      </w:r>
-      <w:r>
-        <w:rPr>
-          <w:rFonts w:hint="eastAsia"/>
-        </w:rPr>
-        <w:t>～</w:t>
-      </w:r>
-      <w:r>
-        <w:rPr>
-          <w:rFonts w:hint="eastAsia"/>
-        </w:rPr>
-        <w:t>35</w:t>
-      </w:r>
-      <w:r>
-        <w:rPr>
-          <w:rFonts w:hint="eastAsia"/>
-        </w:rPr>
-        <w:t>行，每行</w:t>
-      </w:r>
-      <w:r>
-        <w:rPr>
-          <w:rFonts w:hint="eastAsia"/>
-        </w:rPr>
-        <w:t>35</w:t>
-      </w:r>
-      <w:r>
-        <w:rPr>
-          <w:rFonts w:hint="eastAsia"/>
-        </w:rPr>
-        <w:t>～</w:t>
-      </w:r>
-      <w:r>
-        <w:rPr>
-          <w:rFonts w:hint="eastAsia"/>
-        </w:rPr>
-        <w:t>38</w:t>
-      </w:r>
-      <w:r>
-        <w:rPr>
-          <w:rFonts w:hint="eastAsia"/>
-        </w:rPr>
-        <w:t>字。</w:t>
-      </w:r>
-    </w:p>
-    <w:p>
-      <w:pPr>
-        <w:spacing w:line="300" w:lineRule="auto"/>
-        <w:ind w:firstLineChars="200" w:firstLine="420"/>
-        <w:rPr>
-          <w:rFonts w:hint="eastAsia"/>
-        </w:rPr>
-      </w:pPr>
-      <w:r>
-        <w:rPr>
-          <w:rFonts w:hint="eastAsia"/>
-        </w:rPr>
-        <w:t>装订：双面打印印刷，沿长边装订。</w:t>
-      </w:r>
-    </w:p>
-    <w:p>
-      <w:pPr>
-        <w:spacing w:line="300" w:lineRule="auto"/>
-        <w:ind w:firstLineChars="200" w:firstLine="420"/>
-        <w:rPr>
-          <w:rFonts w:hint="eastAsia"/>
-        </w:rPr>
       </w:pPr>
       <w:r>
         <w:rPr>
@@ -849,9 +783,6 @@
       <w:pPr>
         <w:spacing w:line="300" w:lineRule="auto"/>
         <w:ind w:firstLineChars="200" w:firstLine="420"/>
-        <w:rPr>
-          <w:rFonts w:hint="eastAsia"/>
-        </w:rPr>
       </w:pPr>
       <w:r>
         <w:rPr>
@@ -875,9 +806,6 @@
     <w:p>
       <w:pPr>
         <w:spacing w:line="300" w:lineRule="auto"/>
-        <w:rPr>
-          <w:rFonts w:hint="eastAsia"/>
-        </w:rPr>
       </w:pPr>
       <w:r>
         <w:rPr>
@@ -902,15 +830,15 @@
       <w:pPr>
         <w:spacing w:line="300" w:lineRule="auto"/>
         <w:rPr>
+          <w:rFonts w:ascii="黑体" w:eastAsia="黑体"/>
+          <w:sz w:val="24"/>
+        </w:rPr>
+      </w:pPr>
+      <w:r>
+        <w:rPr>
           <w:rFonts w:ascii="黑体" w:eastAsia="黑体" w:hint="eastAsia"/>
           <w:sz w:val="24"/>
         </w:rPr>
-      </w:pPr>
-      <w:r>
-        <w:rPr>
-          <w:rFonts w:ascii="黑体" w:eastAsia="黑体" w:hint="eastAsia"/>
-          <w:sz w:val="24"/>
-        </w:rPr>
         <w:t>4. 体例</w:t>
       </w:r>
     </w:p>
@@ -969,9 +897,6 @@
       <w:pPr>
         <w:spacing w:line="300" w:lineRule="auto"/>
         <w:ind w:firstLine="420"/>
-        <w:rPr>
-          <w:rFonts w:hint="eastAsia"/>
-        </w:rPr>
       </w:pPr>
       <w:r>
         <w:rPr>
@@ -1033,7 +958,7 @@
         <w:spacing w:line="300" w:lineRule="auto"/>
         <w:jc w:val="center"/>
         <w:rPr>
-          <w:rFonts w:ascii="黑体" w:eastAsia="黑体" w:hint="eastAsia"/>
+          <w:rFonts w:ascii="黑体" w:eastAsia="黑体"/>
         </w:rPr>
       </w:pPr>
       <w:r>
@@ -1047,7 +972,6 @@
       <w:tblPr>
         <w:tblW w:w="0" w:type="auto"/>
         <w:jc w:val="center"/>
-        <w:tblInd w:w="0" w:type="dxa"/>
         <w:tblBorders>
           <w:top w:val="single" w:sz="4" w:space="0" w:color="auto"/>
           <w:bottom w:val="single" w:sz="4" w:space="0" w:color="auto"/>
@@ -1554,9 +1478,6 @@
       <w:pPr>
         <w:spacing w:line="300" w:lineRule="auto"/>
         <w:ind w:firstLine="420"/>
-        <w:rPr>
-          <w:rFonts w:hint="eastAsia"/>
-        </w:rPr>
       </w:pPr>
       <w:r>
         <w:rPr>
@@ -1584,9 +1505,6 @@
       <w:pPr>
         <w:spacing w:line="300" w:lineRule="auto"/>
         <w:ind w:firstLineChars="200" w:firstLine="420"/>
-        <w:rPr>
-          <w:rFonts w:hint="eastAsia"/>
-        </w:rPr>
       </w:pPr>
       <w:r>
         <w:rPr>
@@ -1611,9 +1529,6 @@
       <w:pPr>
         <w:spacing w:line="300" w:lineRule="auto"/>
         <w:ind w:firstLineChars="200" w:firstLine="420"/>
-        <w:rPr>
-          <w:rFonts w:hint="eastAsia"/>
-        </w:rPr>
       </w:pPr>
       <w:r>
         <w:rPr>
@@ -1650,9 +1565,6 @@
       <w:pPr>
         <w:spacing w:line="300" w:lineRule="auto"/>
         <w:ind w:firstLine="420"/>
-        <w:rPr>
-          <w:rFonts w:hint="eastAsia"/>
-        </w:rPr>
       </w:pPr>
       <w:r>
         <w:rPr>
@@ -1731,9 +1643,6 @@
       <w:pPr>
         <w:spacing w:line="300" w:lineRule="auto"/>
         <w:ind w:firstLine="420"/>
-        <w:rPr>
-          <w:rFonts w:hint="eastAsia"/>
-        </w:rPr>
       </w:pPr>
       <w:r>
         <w:rPr>
@@ -1836,9 +1745,6 @@
       <w:pPr>
         <w:spacing w:line="300" w:lineRule="auto"/>
         <w:ind w:firstLine="420"/>
-        <w:rPr>
-          <w:rFonts w:hint="eastAsia"/>
-        </w:rPr>
       </w:pPr>
       <w:r>
         <w:rPr>
@@ -1857,9 +1763,6 @@
       <w:pPr>
         <w:spacing w:line="300" w:lineRule="auto"/>
         <w:ind w:firstLineChars="200" w:firstLine="420"/>
-        <w:rPr>
-          <w:rFonts w:hint="eastAsia"/>
-        </w:rPr>
       </w:pPr>
       <w:r>
         <w:rPr>
@@ -1930,9 +1833,6 @@
       <w:pPr>
         <w:spacing w:line="300" w:lineRule="auto"/>
         <w:ind w:firstLineChars="200" w:firstLine="420"/>
-        <w:rPr>
-          <w:rFonts w:hint="eastAsia"/>
-        </w:rPr>
       </w:pPr>
       <w:r>
         <w:rPr>
@@ -1984,9 +1884,6 @@
       <w:pPr>
         <w:spacing w:line="300" w:lineRule="auto"/>
         <w:ind w:firstLineChars="200" w:firstLine="420"/>
-        <w:rPr>
-          <w:rFonts w:hint="eastAsia"/>
-        </w:rPr>
       </w:pPr>
       <w:r>
         <w:rPr>
@@ -2071,9 +1968,6 @@
       <w:pPr>
         <w:spacing w:line="300" w:lineRule="auto"/>
         <w:ind w:firstLineChars="200" w:firstLine="420"/>
-        <w:rPr>
-          <w:rFonts w:hint="eastAsia"/>
-        </w:rPr>
       </w:pPr>
       <w:r>
         <w:rPr>
@@ -2101,9 +1995,6 @@
       <w:pPr>
         <w:spacing w:line="300" w:lineRule="auto"/>
         <w:ind w:firstLineChars="200" w:firstLine="420"/>
-        <w:rPr>
-          <w:rFonts w:hint="eastAsia"/>
-        </w:rPr>
       </w:pPr>
       <w:r>
         <w:rPr>
@@ -2115,9 +2006,6 @@
     <w:p>
       <w:pPr>
         <w:spacing w:line="300" w:lineRule="auto"/>
-        <w:rPr>
-          <w:rFonts w:hint="eastAsia"/>
-        </w:rPr>
       </w:pPr>
       <w:r>
         <w:rPr>
@@ -2129,9 +2017,6 @@
     <w:p>
       <w:pPr>
         <w:spacing w:line="300" w:lineRule="auto"/>
-        <w:rPr>
-          <w:rFonts w:hint="eastAsia"/>
-        </w:rPr>
       </w:pPr>
       <w:r>
         <w:rPr>
@@ -2191,9 +2076,6 @@
     <w:p>
       <w:pPr>
         <w:spacing w:line="300" w:lineRule="auto"/>
-        <w:rPr>
-          <w:rFonts w:hint="eastAsia"/>
-        </w:rPr>
       </w:pPr>
       <w:r>
         <w:rPr>
@@ -2205,9 +2087,6 @@
     <w:p>
       <w:pPr>
         <w:spacing w:line="300" w:lineRule="auto"/>
-        <w:rPr>
-          <w:rFonts w:hint="eastAsia"/>
-        </w:rPr>
       </w:pPr>
       <w:r>
         <w:rPr>
@@ -2267,9 +2146,6 @@
     <w:p>
       <w:pPr>
         <w:spacing w:line="300" w:lineRule="auto"/>
-        <w:rPr>
-          <w:rFonts w:hint="eastAsia"/>
-        </w:rPr>
       </w:pPr>
       <w:r>
         <w:rPr>
@@ -2281,9 +2157,6 @@
     <w:p>
       <w:pPr>
         <w:spacing w:line="300" w:lineRule="auto"/>
-        <w:rPr>
-          <w:rFonts w:hint="eastAsia"/>
-        </w:rPr>
       </w:pPr>
       <w:r>
         <w:rPr>
@@ -2344,7 +2217,6 @@
       <w:pPr>
         <w:spacing w:line="300" w:lineRule="auto"/>
         <w:rPr>
-          <w:rFonts w:hint="eastAsia"/>
           <w:bCs/>
         </w:rPr>
       </w:pPr>
@@ -2359,9 +2231,6 @@
     <w:p>
       <w:pPr>
         <w:spacing w:line="300" w:lineRule="auto"/>
-        <w:rPr>
-          <w:rFonts w:hint="eastAsia"/>
-        </w:rPr>
       </w:pPr>
       <w:r>
         <w:rPr>
@@ -2434,9 +2303,6 @@
       <w:pPr>
         <w:spacing w:line="300" w:lineRule="auto"/>
         <w:ind w:left="315" w:hangingChars="150" w:hanging="315"/>
-        <w:rPr>
-          <w:rFonts w:hint="eastAsia"/>
-        </w:rPr>
       </w:pPr>
       <w:r>
         <w:rPr>
@@ -2448,9 +2314,6 @@
     <w:p>
       <w:pPr>
         <w:spacing w:line="300" w:lineRule="auto"/>
-        <w:rPr>
-          <w:rFonts w:hint="eastAsia"/>
-        </w:rPr>
       </w:pPr>
       <w:r>
         <w:rPr>
@@ -2513,9 +2376,6 @@
     <w:p>
       <w:pPr>
         <w:spacing w:line="300" w:lineRule="auto"/>
-        <w:rPr>
-          <w:rFonts w:hint="eastAsia"/>
-        </w:rPr>
       </w:pPr>
       <w:r>
         <w:rPr>
@@ -2527,9 +2387,6 @@
     <w:p>
       <w:pPr>
         <w:spacing w:line="300" w:lineRule="auto"/>
-        <w:rPr>
-          <w:rFonts w:hint="eastAsia"/>
-        </w:rPr>
       </w:pPr>
       <w:r>
         <w:rPr>
@@ -2596,9 +2453,6 @@
       <w:pPr>
         <w:spacing w:line="300" w:lineRule="auto"/>
         <w:ind w:firstLineChars="300" w:firstLine="630"/>
-        <w:rPr>
-          <w:rFonts w:hint="eastAsia"/>
-        </w:rPr>
       </w:pPr>
       <w:r>
         <w:rPr>
@@ -2610,9 +2464,6 @@
     <w:p>
       <w:pPr>
         <w:spacing w:line="300" w:lineRule="auto"/>
-        <w:rPr>
-          <w:rFonts w:hint="eastAsia"/>
-        </w:rPr>
       </w:pPr>
       <w:r>
         <w:rPr>
@@ -2624,9 +2475,6 @@
     <w:p>
       <w:pPr>
         <w:spacing w:line="300" w:lineRule="auto"/>
-        <w:rPr>
-          <w:rFonts w:hint="eastAsia"/>
-        </w:rPr>
       </w:pPr>
       <w:r>
         <w:t>[</w:t>
@@ -2708,7 +2556,6 @@
       <w:pPr>
         <w:spacing w:line="300" w:lineRule="auto"/>
         <w:rPr>
-          <w:rFonts w:hint="eastAsia"/>
           <w:bCs/>
         </w:rPr>
       </w:pPr>
@@ -2724,9 +2571,6 @@
       <w:pPr>
         <w:spacing w:line="300" w:lineRule="auto"/>
         <w:ind w:left="315" w:hangingChars="150" w:hanging="315"/>
-        <w:rPr>
-          <w:rFonts w:hint="eastAsia"/>
-        </w:rPr>
       </w:pPr>
       <w:r>
         <w:rPr>
@@ -2816,54 +2660,51 @@
         <w:rPr>
           <w:rFonts w:hint="eastAsia"/>
         </w:rPr>
+        <w:t>（</w:t>
+      </w:r>
+      <w:r>
+        <w:rPr>
+          <w:rFonts w:hint="eastAsia"/>
+        </w:rPr>
+        <w:t>1</w:t>
+      </w:r>
+      <w:r>
+        <w:rPr>
+          <w:rFonts w:hint="eastAsia"/>
+        </w:rPr>
+        <w:t>）：</w:t>
+      </w:r>
+      <w:r>
+        <w:rPr>
+          <w:rFonts w:hint="eastAsia"/>
+        </w:rPr>
+        <w:t xml:space="preserve">38-40. </w:t>
+      </w:r>
+      <w:r>
+        <w:rPr>
+          <w:rFonts w:hint="eastAsia"/>
+        </w:rPr>
+        <w:t>（</w:t>
+      </w:r>
+      <w:r>
+        <w:rPr>
+          <w:rFonts w:hint="eastAsia"/>
+        </w:rPr>
+        <w:t>EI</w:t>
+      </w:r>
+      <w:r>
+        <w:rPr>
+          <w:rFonts w:hint="eastAsia"/>
+        </w:rPr>
+        <w:t>检索）（对应论文第五章）</w:t>
+      </w:r>
+    </w:p>
+    <w:p>
+      <w:pPr>
+        <w:spacing w:line="300" w:lineRule="auto"/>
+      </w:pPr>
+      <w:r>
         <w:lastRenderedPageBreak/>
-        <w:t>（</w:t>
-      </w:r>
-      <w:r>
-        <w:rPr>
-          <w:rFonts w:hint="eastAsia"/>
-        </w:rPr>
-        <w:t>1</w:t>
-      </w:r>
-      <w:r>
-        <w:rPr>
-          <w:rFonts w:hint="eastAsia"/>
-        </w:rPr>
-        <w:t>）：</w:t>
-      </w:r>
-      <w:r>
-        <w:rPr>
-          <w:rFonts w:hint="eastAsia"/>
-        </w:rPr>
-        <w:t xml:space="preserve">38-40. </w:t>
-      </w:r>
-      <w:r>
-        <w:rPr>
-          <w:rFonts w:hint="eastAsia"/>
-        </w:rPr>
-        <w:t>（</w:t>
-      </w:r>
-      <w:r>
-        <w:rPr>
-          <w:rFonts w:hint="eastAsia"/>
-        </w:rPr>
-        <w:t>EI</w:t>
-      </w:r>
-      <w:r>
-        <w:rPr>
-          <w:rFonts w:hint="eastAsia"/>
-        </w:rPr>
-        <w:t>检索）（对应论文第五章）</w:t>
-      </w:r>
-    </w:p>
-    <w:p>
-      <w:pPr>
-        <w:spacing w:line="300" w:lineRule="auto"/>
-        <w:rPr>
-          <w:rFonts w:hint="eastAsia"/>
-        </w:rPr>
-      </w:pPr>
-      <w:r>
         <w:t>[</w:t>
       </w:r>
       <w:r>
@@ -2916,7 +2757,6 @@
       <w:pPr>
         <w:spacing w:beforeLines="50" w:before="156" w:line="300" w:lineRule="auto"/>
         <w:rPr>
-          <w:rFonts w:hint="eastAsia"/>
           <w:b/>
           <w:bCs/>
         </w:rPr>
@@ -2941,7 +2781,6 @@
       <w:pPr>
         <w:spacing w:line="300" w:lineRule="auto"/>
         <w:rPr>
-          <w:rFonts w:hint="eastAsia"/>
           <w:bCs/>
         </w:rPr>
       </w:pPr>
@@ -2958,7 +2797,6 @@
         <w:spacing w:line="300" w:lineRule="auto"/>
         <w:ind w:leftChars="1" w:left="390" w:hangingChars="185" w:hanging="388"/>
         <w:rPr>
-          <w:rFonts w:hint="eastAsia"/>
           <w:szCs w:val="21"/>
         </w:rPr>
       </w:pPr>
@@ -3131,7 +2969,6 @@
         <w:spacing w:line="300" w:lineRule="auto"/>
         <w:ind w:left="315" w:hangingChars="150" w:hanging="315"/>
         <w:rPr>
-          <w:rFonts w:hint="eastAsia"/>
           <w:szCs w:val="21"/>
         </w:rPr>
       </w:pPr>
@@ -3211,7 +3048,6 @@
       <w:pPr>
         <w:spacing w:beforeLines="50" w:before="156"/>
         <w:rPr>
-          <w:rFonts w:hint="eastAsia"/>
           <w:b/>
           <w:bCs/>
         </w:rPr>
@@ -3229,7 +3065,6 @@
       <w:pPr>
         <w:jc w:val="center"/>
         <w:rPr>
-          <w:rFonts w:hint="eastAsia"/>
           <w:szCs w:val="21"/>
         </w:rPr>
       </w:pPr>
@@ -3258,9 +3093,6 @@
     <w:p>
       <w:pPr>
         <w:jc w:val="center"/>
-        <w:rPr>
-          <w:rFonts w:hint="eastAsia"/>
-        </w:rPr>
       </w:pPr>
       <w:r>
         <w:rPr>
@@ -3273,7 +3105,6 @@
       <w:tblPr>
         <w:tblW w:w="0" w:type="auto"/>
         <w:jc w:val="center"/>
-        <w:tblInd w:w="0" w:type="dxa"/>
         <w:tblBorders>
           <w:top w:val="single" w:sz="12" w:space="0" w:color="auto"/>
           <w:bottom w:val="single" w:sz="12" w:space="0" w:color="auto"/>
@@ -3819,10 +3650,10 @@
                   <v:path o:extrusionok="f" gradientshapeok="t" o:connecttype="rect"/>
                   <o:lock v:ext="edit" aspectratio="t"/>
                 </v:shapetype>
-                <v:shape id="Object 1" o:spid="_x0000_i1025" type="#_x0000_t75" style="width:10.5pt;height:10.5pt;mso-wrap-style:square;mso-position-horizontal-relative:page;mso-position-vertical-relative:page" o:ole="">
+                <v:shape id="Object 1" o:spid="_x0000_i1025" type="#_x0000_t75" style="width:10.75pt;height:10.75pt;mso-wrap-style:square;mso-position-horizontal-relative:page;mso-position-vertical-relative:page" o:ole="">
                   <v:imagedata r:id="rId6" o:title=""/>
                 </v:shape>
-                <o:OLEObject Type="Embed" ProgID="Equation.DSMT4" ShapeID="Object 1" DrawAspect="Content" ObjectID="_1839590938" r:id="rId7"/>
+                <o:OLEObject Type="Embed" ProgID="Equation.DSMT4" ShapeID="Object 1" DrawAspect="Content" ObjectID="_1839740989" r:id="rId7"/>
               </w:object>
             </w:r>
           </w:p>
@@ -3866,17 +3697,10 @@
         </w:tc>
       </w:tr>
     </w:tbl>
-    <w:p>
-      <w:pPr>
-        <w:rPr>
-          <w:rFonts w:hint="eastAsia"/>
-        </w:rPr>
-      </w:pPr>
-    </w:p>
-    <w:p>
-      <w:pPr>
-        <w:rPr>
-          <w:rFonts w:hint="eastAsia"/>
+    <w:p/>
+    <w:p>
+      <w:pPr>
+        <w:rPr>
           <w:b/>
           <w:bCs/>
         </w:rPr>
@@ -3896,7 +3720,6 @@
         <w:ind w:firstLineChars="200" w:firstLine="480"/>
         <w:jc w:val="center"/>
         <w:rPr>
-          <w:rFonts w:hint="eastAsia"/>
           <w:sz w:val="24"/>
         </w:rPr>
       </w:pPr>
@@ -3906,10 +3729,10 @@
           <w:sz w:val="24"/>
         </w:rPr>
         <w:object w:dxaOrig="2659" w:dyaOrig="619" w14:anchorId="5EBA7B26">
-          <v:shape id="Object 2" o:spid="_x0000_i1026" type="#_x0000_t75" style="width:132.75pt;height:30.75pt;mso-wrap-style:square;mso-position-horizontal-relative:page;mso-position-vertical-relative:page" o:ole="">
+          <v:shape id="Object 2" o:spid="_x0000_i1026" type="#_x0000_t75" style="width:132.2pt;height:31.15pt;mso-wrap-style:square;mso-position-horizontal-relative:page;mso-position-vertical-relative:page" o:ole="">
             <v:imagedata r:id="rId8" o:title=""/>
           </v:shape>
-          <o:OLEObject Type="Embed" ProgID="Equation.3" ShapeID="Object 2" DrawAspect="Content" ObjectID="_1839590939" r:id="rId9"/>
+          <o:OLEObject Type="Embed" ProgID="Equation.3" ShapeID="Object 2" DrawAspect="Content" ObjectID="_1839740990" r:id="rId9"/>
         </w:object>
       </w:r>
       <w:r>
@@ -3924,7 +3747,6 @@
       <w:pPr>
         <w:jc w:val="center"/>
         <w:rPr>
-          <w:rFonts w:hint="eastAsia"/>
           <w:sz w:val="24"/>
         </w:rPr>
       </w:pPr>
@@ -3934,10 +3756,10 @@
           <w:sz w:val="24"/>
         </w:rPr>
         <w:object w:dxaOrig="4740" w:dyaOrig="679" w14:anchorId="33133B3F">
-          <v:shape id="Object 3" o:spid="_x0000_i1027" type="#_x0000_t75" style="width:237pt;height:33.75pt;mso-wrap-style:square;mso-position-horizontal-relative:page;mso-position-vertical-relative:page" o:ole="">
+          <v:shape id="Object 3" o:spid="_x0000_i1027" type="#_x0000_t75" style="width:237.5pt;height:33.3pt;mso-wrap-style:square;mso-position-horizontal-relative:page;mso-position-vertical-relative:page" o:ole="">
             <v:imagedata r:id="rId10" o:title=""/>
           </v:shape>
-          <o:OLEObject Type="Embed" ProgID="Equation.3" ShapeID="Object 3" DrawAspect="Content" ObjectID="_1839590940" r:id="rId11"/>
+          <o:OLEObject Type="Embed" ProgID="Equation.3" ShapeID="Object 3" DrawAspect="Content" ObjectID="_1839740991" r:id="rId11"/>
         </w:object>
       </w:r>
       <w:r>
@@ -3948,17 +3770,10 @@
         <w:t xml:space="preserve">  (6.2)</w:t>
       </w:r>
     </w:p>
-    <w:p>
-      <w:pPr>
-        <w:rPr>
-          <w:rFonts w:hint="eastAsia"/>
-        </w:rPr>
-      </w:pPr>
-    </w:p>
-    <w:p>
-      <w:pPr>
-        <w:rPr>
-          <w:rFonts w:hint="eastAsia"/>
+    <w:p/>
+    <w:p>
+      <w:pPr>
+        <w:rPr>
           <w:b/>
           <w:bCs/>
         </w:rPr>
@@ -3975,16 +3790,13 @@
     <w:p>
       <w:pPr>
         <w:jc w:val="center"/>
-        <w:rPr>
-          <w:rFonts w:hint="eastAsia"/>
-        </w:rPr>
       </w:pPr>
       <w:r>
         <w:object w:dxaOrig="5747" w:dyaOrig="4357" w14:anchorId="03D49C95">
-          <v:shape id="Object 4" o:spid="_x0000_i1028" type="#_x0000_t75" style="width:238.5pt;height:181.5pt;mso-wrap-style:square;mso-position-horizontal-relative:page;mso-position-vertical-relative:page" o:ole="">
+          <v:shape id="Object 4" o:spid="_x0000_i1028" type="#_x0000_t75" style="width:238.55pt;height:181.6pt;mso-wrap-style:square;mso-position-horizontal-relative:page;mso-position-vertical-relative:page" o:ole="">
             <v:imagedata r:id="rId12" o:title="" croptop="3055f" cropbottom="3819f" cropleft="1832f" cropright="1832f"/>
           </v:shape>
-          <o:OLEObject Type="Embed" ProgID="Origin50.Graph" ShapeID="Object 4" DrawAspect="Content" ObjectID="_1839590941" r:id="rId13"/>
+          <o:OLEObject Type="Embed" ProgID="Origin50.Graph" ShapeID="Object 4" DrawAspect="Content" ObjectID="_1839740992" r:id="rId13"/>
         </w:object>
       </w:r>
     </w:p>
@@ -3992,7 +3804,6 @@
       <w:pPr>
         <w:jc w:val="center"/>
         <w:rPr>
-          <w:rFonts w:hint="eastAsia"/>
           <w:kern w:val="0"/>
         </w:rPr>
       </w:pPr>
@@ -4053,7 +3864,6 @@
       <w:pPr>
         <w:jc w:val="center"/>
         <w:rPr>
-          <w:rFonts w:hint="eastAsia"/>
           <w:sz w:val="18"/>
         </w:rPr>
       </w:pPr>
@@ -4105,7 +3915,6 @@
       <w:pPr>
         <w:jc w:val="center"/>
         <w:rPr>
-          <w:rFonts w:hint="eastAsia"/>
           <w:sz w:val="15"/>
         </w:rPr>
       </w:pPr>
@@ -4135,6 +3944,7 @@
           <w:rFonts w:eastAsia="黑体"/>
           <w:sz w:val="28"/>
         </w:rPr>
+        <w:lastRenderedPageBreak/>
         <w:t>分类号</w:t>
       </w:r>
       <w:r>
@@ -4253,60 +4063,42 @@
         <w:spacing w:line="480" w:lineRule="auto"/>
         <w:jc w:val="center"/>
         <w:rPr>
+          <w:rFonts w:ascii="宋体" w:hAnsi="宋体" w:hint="eastAsia"/>
+          <w:sz w:val="44"/>
+          <w:szCs w:val="44"/>
+        </w:rPr>
+      </w:pPr>
+      <w:r>
+        <w:rPr>
           <w:rFonts w:ascii="宋体" w:hAnsi="宋体"/>
           <w:sz w:val="44"/>
           <w:szCs w:val="44"/>
         </w:rPr>
-      </w:pPr>
-      <w:r>
-        <w:rPr>
-          <w:rFonts w:ascii="宋体" w:hAnsi="宋体"/>
-          <w:sz w:val="44"/>
-          <w:szCs w:val="44"/>
-        </w:rPr>
         <w:t>学  位  论  文</w:t>
       </w:r>
     </w:p>
-    <w:p>
-      <w:pPr>
-        <w:rPr>
-          <w:rFonts w:hint="eastAsia"/>
-        </w:rPr>
-      </w:pPr>
-    </w:p>
+    <w:p/>
     <w:p>
       <w:pPr>
         <w:jc w:val="center"/>
+        <w:rPr>
+          <w:rFonts w:eastAsia="黑体"/>
+          <w:sz w:val="36"/>
+          <w:szCs w:val="36"/>
+        </w:rPr>
+      </w:pPr>
+      <w:r>
         <w:rPr>
           <w:rFonts w:eastAsia="黑体" w:hint="eastAsia"/>
           <w:sz w:val="36"/>
           <w:szCs w:val="36"/>
         </w:rPr>
-      </w:pPr>
-      <w:r>
-        <w:rPr>
-          <w:rFonts w:eastAsia="黑体" w:hint="eastAsia"/>
-          <w:sz w:val="36"/>
-          <w:szCs w:val="36"/>
-        </w:rPr>
         <w:t>面向机械翻译的随机词汇语义驱动方法的研究</w:t>
       </w:r>
     </w:p>
-    <w:p>
-      <w:pPr>
-        <w:rPr>
-          <w:rFonts w:hint="eastAsia"/>
-        </w:rPr>
-      </w:pPr>
-    </w:p>
     <w:p/>
-    <w:p>
-      <w:pPr>
-        <w:rPr>
-          <w:rFonts w:hint="eastAsia"/>
-        </w:rPr>
-      </w:pPr>
-    </w:p>
+    <w:p/>
+    <w:p/>
     <w:tbl>
       <w:tblPr>
         <w:tblW w:w="9047" w:type="dxa"/>
@@ -4483,7 +4275,7 @@
           <w:p>
             <w:pPr>
               <w:rPr>
-                <w:rFonts w:ascii="宋体" w:hAnsi="宋体"/>
+                <w:rFonts w:ascii="宋体" w:hAnsi="宋体" w:hint="eastAsia"/>
                 <w:sz w:val="28"/>
                 <w:szCs w:val="28"/>
               </w:rPr>
@@ -4618,7 +4410,7 @@
           <w:p>
             <w:pPr>
               <w:rPr>
-                <w:rFonts w:ascii="宋体" w:hAnsi="宋体"/>
+                <w:rFonts w:ascii="宋体" w:hAnsi="宋体" w:hint="eastAsia"/>
                 <w:sz w:val="28"/>
                 <w:szCs w:val="28"/>
               </w:rPr>
@@ -4820,48 +4612,12 @@
         </w:tc>
       </w:tr>
     </w:tbl>
-    <w:p>
-      <w:pPr>
-        <w:rPr>
-          <w:rFonts w:hint="eastAsia"/>
-        </w:rPr>
-      </w:pPr>
-    </w:p>
-    <w:p>
-      <w:pPr>
-        <w:rPr>
-          <w:rFonts w:hint="eastAsia"/>
-        </w:rPr>
-      </w:pPr>
-    </w:p>
-    <w:p>
-      <w:pPr>
-        <w:rPr>
-          <w:rFonts w:hint="eastAsia"/>
-        </w:rPr>
-      </w:pPr>
-    </w:p>
-    <w:p>
-      <w:pPr>
-        <w:rPr>
-          <w:rFonts w:hint="eastAsia"/>
-        </w:rPr>
-      </w:pPr>
-    </w:p>
-    <w:p>
-      <w:pPr>
-        <w:rPr>
-          <w:rFonts w:hint="eastAsia"/>
-        </w:rPr>
-      </w:pPr>
-    </w:p>
-    <w:p>
-      <w:pPr>
-        <w:rPr>
-          <w:rFonts w:hint="eastAsia"/>
-        </w:rPr>
-      </w:pPr>
-    </w:p>
+    <w:p/>
+    <w:p/>
+    <w:p/>
+    <w:p/>
+    <w:p/>
+    <w:p/>
     <w:p>
       <w:pPr>
         <w:jc w:val="center"/>
@@ -4882,7 +4638,6 @@
       <w:pPr>
         <w:jc w:val="center"/>
         <w:rPr>
-          <w:rFonts w:hint="eastAsia"/>
           <w:sz w:val="28"/>
         </w:rPr>
       </w:pPr>
@@ -4919,7 +4674,6 @@
       <w:pPr>
         <w:jc w:val="center"/>
         <w:rPr>
-          <w:rFonts w:hint="eastAsia"/>
           <w:sz w:val="28"/>
         </w:rPr>
       </w:pPr>
@@ -4928,23 +4682,15 @@
       <w:pPr>
         <w:jc w:val="center"/>
         <w:rPr>
-          <w:rFonts w:hint="eastAsia"/>
           <w:sz w:val="28"/>
         </w:rPr>
       </w:pPr>
     </w:p>
-    <w:p>
-      <w:pPr>
-        <w:rPr>
-          <w:rFonts w:hint="eastAsia"/>
-        </w:rPr>
-      </w:pPr>
-    </w:p>
+    <w:p/>
     <w:p>
       <w:pPr>
         <w:pStyle w:val="5"/>
         <w:rPr>
-          <w:rFonts w:hint="eastAsia"/>
           <w:sz w:val="28"/>
           <w:szCs w:val="28"/>
         </w:rPr>
@@ -4955,6 +4701,7 @@
           <w:sz w:val="28"/>
           <w:szCs w:val="28"/>
         </w:rPr>
+        <w:lastRenderedPageBreak/>
         <w:t>A Dissertation in Computer Software and Theory</w:t>
       </w:r>
     </w:p>
@@ -5001,32 +4748,13 @@
         <w:t>Lexical Semantic Driven Approach</w:t>
       </w:r>
     </w:p>
-    <w:p>
-      <w:pPr>
-        <w:rPr>
-          <w:rFonts w:hint="eastAsia"/>
-        </w:rPr>
-      </w:pPr>
-    </w:p>
-    <w:p>
-      <w:pPr>
-        <w:rPr>
-          <w:rFonts w:hint="eastAsia"/>
-        </w:rPr>
-      </w:pPr>
-    </w:p>
-    <w:p>
-      <w:pPr>
-        <w:rPr>
-          <w:rFonts w:hint="eastAsia"/>
-        </w:rPr>
-      </w:pPr>
-    </w:p>
+    <w:p/>
+    <w:p/>
+    <w:p/>
     <w:p>
       <w:pPr>
         <w:jc w:val="center"/>
         <w:rPr>
-          <w:rFonts w:hint="eastAsia"/>
           <w:sz w:val="28"/>
           <w:szCs w:val="28"/>
         </w:rPr>
@@ -5053,16 +4781,12 @@
     <w:p>
       <w:pPr>
         <w:jc w:val="center"/>
-        <w:rPr>
-          <w:rFonts w:hint="eastAsia"/>
-        </w:rPr>
       </w:pPr>
     </w:p>
     <w:p>
       <w:pPr>
         <w:jc w:val="center"/>
         <w:rPr>
-          <w:rFonts w:hint="eastAsia"/>
           <w:sz w:val="28"/>
           <w:szCs w:val="28"/>
         </w:rPr>
@@ -5078,123 +4802,26 @@
     </w:p>
     <w:p/>
     <w:p/>
-    <w:p>
-      <w:pPr>
-        <w:rPr>
-          <w:rFonts w:hint="eastAsia"/>
-        </w:rPr>
-      </w:pPr>
-    </w:p>
-    <w:p>
-      <w:pPr>
-        <w:rPr>
-          <w:rFonts w:hint="eastAsia"/>
-        </w:rPr>
-      </w:pPr>
-    </w:p>
-    <w:p>
-      <w:pPr>
-        <w:rPr>
-          <w:rFonts w:hint="eastAsia"/>
-        </w:rPr>
-      </w:pPr>
-    </w:p>
-    <w:p>
-      <w:pPr>
-        <w:rPr>
-          <w:rFonts w:hint="eastAsia"/>
-        </w:rPr>
-      </w:pPr>
-    </w:p>
-    <w:p>
-      <w:pPr>
-        <w:rPr>
-          <w:rFonts w:hint="eastAsia"/>
-        </w:rPr>
-      </w:pPr>
-    </w:p>
-    <w:p>
-      <w:pPr>
-        <w:rPr>
-          <w:rFonts w:hint="eastAsia"/>
-        </w:rPr>
-      </w:pPr>
-    </w:p>
-    <w:p>
-      <w:pPr>
-        <w:rPr>
-          <w:rFonts w:hint="eastAsia"/>
-        </w:rPr>
-      </w:pPr>
-    </w:p>
-    <w:p>
-      <w:pPr>
-        <w:rPr>
-          <w:rFonts w:hint="eastAsia"/>
-        </w:rPr>
-      </w:pPr>
-    </w:p>
-    <w:p>
-      <w:pPr>
-        <w:rPr>
-          <w:rFonts w:hint="eastAsia"/>
-        </w:rPr>
-      </w:pPr>
-    </w:p>
-    <w:p>
-      <w:pPr>
-        <w:rPr>
-          <w:rFonts w:hint="eastAsia"/>
-        </w:rPr>
-      </w:pPr>
-    </w:p>
-    <w:p>
-      <w:pPr>
-        <w:rPr>
-          <w:rFonts w:hint="eastAsia"/>
-        </w:rPr>
-      </w:pPr>
-    </w:p>
-    <w:p>
-      <w:pPr>
-        <w:rPr>
-          <w:rFonts w:hint="eastAsia"/>
-        </w:rPr>
-      </w:pPr>
-    </w:p>
-    <w:p>
-      <w:pPr>
-        <w:rPr>
-          <w:rFonts w:hint="eastAsia"/>
-        </w:rPr>
-      </w:pPr>
-    </w:p>
-    <w:p>
-      <w:pPr>
-        <w:rPr>
-          <w:rFonts w:hint="eastAsia"/>
-        </w:rPr>
-      </w:pPr>
-    </w:p>
-    <w:p>
-      <w:pPr>
-        <w:rPr>
-          <w:rFonts w:hint="eastAsia"/>
-        </w:rPr>
-      </w:pPr>
-    </w:p>
-    <w:p>
-      <w:pPr>
-        <w:rPr>
-          <w:rFonts w:hint="eastAsia"/>
-        </w:rPr>
-      </w:pPr>
-    </w:p>
+    <w:p/>
+    <w:p/>
+    <w:p/>
+    <w:p/>
+    <w:p/>
+    <w:p/>
+    <w:p/>
+    <w:p/>
+    <w:p/>
+    <w:p/>
+    <w:p/>
+    <w:p/>
+    <w:p/>
+    <w:p/>
+    <w:p/>
+    <w:p/>
     <w:p>
       <w:pPr>
         <w:jc w:val="center"/>
         <w:rPr>
-          <w:rFonts w:hint="eastAsia"/>
           <w:b/>
           <w:bCs/>
           <w:sz w:val="32"/>
@@ -5236,25 +4863,18 @@
     <w:p>
       <w:pPr>
         <w:rPr>
-          <w:rFonts w:hint="eastAsia"/>
           <w:sz w:val="32"/>
           <w:szCs w:val="32"/>
         </w:rPr>
       </w:pPr>
     </w:p>
-    <w:p>
-      <w:pPr>
-        <w:rPr>
-          <w:rFonts w:hint="eastAsia"/>
-        </w:rPr>
-      </w:pPr>
-    </w:p>
+    <w:p/>
     <w:p>
       <w:pPr>
         <w:pStyle w:val="a3"/>
         <w:spacing w:beforeLines="100" w:before="312" w:afterLines="100" w:after="312"/>
         <w:rPr>
-          <w:rFonts w:ascii="黑体" w:eastAsia="黑体" w:hint="eastAsia"/>
+          <w:rFonts w:ascii="黑体" w:eastAsia="黑体"/>
           <w:b w:val="0"/>
           <w:bCs w:val="0"/>
           <w:szCs w:val="44"/>
@@ -5275,6 +4895,7 @@
           <w:bCs w:val="0"/>
           <w:szCs w:val="44"/>
         </w:rPr>
+        <w:lastRenderedPageBreak/>
         <w:t>独创性声明</w:t>
       </w:r>
       <w:bookmarkEnd w:id="9"/>
@@ -5291,7 +4912,6 @@
         <w:spacing w:line="288" w:lineRule="auto"/>
         <w:ind w:firstLineChars="200" w:firstLine="560"/>
         <w:rPr>
-          <w:rFonts w:hint="eastAsia"/>
           <w:sz w:val="28"/>
           <w:szCs w:val="28"/>
         </w:rPr>
@@ -5451,19 +5071,19 @@
         <w:pStyle w:val="a3"/>
         <w:spacing w:beforeLines="100" w:before="312" w:afterLines="100" w:after="312"/>
         <w:rPr>
+          <w:rFonts w:ascii="黑体" w:eastAsia="黑体"/>
+          <w:b w:val="0"/>
+          <w:bCs w:val="0"/>
+          <w:szCs w:val="44"/>
+        </w:rPr>
+      </w:pPr>
+      <w:r>
+        <w:rPr>
           <w:rFonts w:ascii="黑体" w:eastAsia="黑体" w:hint="eastAsia"/>
           <w:b w:val="0"/>
           <w:bCs w:val="0"/>
           <w:szCs w:val="44"/>
         </w:rPr>
-      </w:pPr>
-      <w:r>
-        <w:rPr>
-          <w:rFonts w:ascii="黑体" w:eastAsia="黑体" w:hint="eastAsia"/>
-          <w:b w:val="0"/>
-          <w:bCs w:val="0"/>
-          <w:szCs w:val="44"/>
-        </w:rPr>
         <w:t>学位论文版权使用授权书</w:t>
       </w:r>
     </w:p>
@@ -5648,18 +5268,35 @@
     <w:p>
       <w:pPr>
         <w:rPr>
-          <w:rFonts w:ascii="宋体" w:hAnsi="宋体"/>
+          <w:rFonts w:ascii="宋体" w:hAnsi="宋体" w:hint="eastAsia"/>
           <w:szCs w:val="21"/>
         </w:rPr>
       </w:pPr>
     </w:p>
     <w:p>
       <w:pPr>
+        <w:rPr>
+          <w:rFonts w:ascii="宋体" w:hAnsi="宋体" w:hint="eastAsia"/>
+          <w:sz w:val="28"/>
+          <w:szCs w:val="28"/>
+        </w:rPr>
+      </w:pPr>
+      <w:r>
         <w:rPr>
           <w:rFonts w:ascii="宋体" w:hAnsi="宋体"/>
           <w:sz w:val="28"/>
           <w:szCs w:val="28"/>
         </w:rPr>
+        <w:t>学位论文作者签名：               导师签名：</w:t>
+      </w:r>
+    </w:p>
+    <w:p>
+      <w:pPr>
+        <w:rPr>
+          <w:rFonts w:ascii="宋体" w:hAnsi="宋体" w:hint="eastAsia"/>
+          <w:sz w:val="28"/>
+          <w:szCs w:val="28"/>
+        </w:rPr>
       </w:pPr>
       <w:r>
         <w:rPr>
@@ -5667,38 +5304,19 @@
           <w:sz w:val="28"/>
           <w:szCs w:val="28"/>
         </w:rPr>
-        <w:t>学位论文作者签名：               导师签名：</w:t>
-      </w:r>
-    </w:p>
-    <w:p>
-      <w:pPr>
-        <w:rPr>
-          <w:rFonts w:ascii="宋体" w:hAnsi="宋体" w:hint="eastAsia"/>
-          <w:sz w:val="28"/>
+        <w:t>签字日期：                       签字日期：</w:t>
+      </w:r>
+    </w:p>
+    <w:p>
+      <w:pPr>
+        <w:rPr>
           <w:szCs w:val="28"/>
         </w:rPr>
       </w:pPr>
-      <w:r>
-        <w:rPr>
-          <w:rFonts w:ascii="宋体" w:hAnsi="宋体"/>
-          <w:sz w:val="28"/>
-          <w:szCs w:val="28"/>
-        </w:rPr>
-        <w:t>签字日期：                       签字日期：</w:t>
-      </w:r>
-    </w:p>
-    <w:p>
-      <w:pPr>
-        <w:rPr>
-          <w:rFonts w:hint="eastAsia"/>
-          <w:szCs w:val="28"/>
-        </w:rPr>
-      </w:pPr>
-    </w:p>
-    <w:p>
-      <w:pPr>
-        <w:rPr>
-          <w:rFonts w:hint="eastAsia"/>
+    </w:p>
+    <w:p>
+      <w:pPr>
+        <w:rPr>
           <w:szCs w:val="28"/>
         </w:rPr>
       </w:pPr>
@@ -5722,18 +5340,27 @@
         <w:spacing w:beforeLines="100" w:before="312" w:afterLines="100" w:after="312"/>
         <w:jc w:val="center"/>
         <w:rPr>
+          <w:rFonts w:eastAsia="黑体"/>
+          <w:sz w:val="44"/>
+          <w:szCs w:val="44"/>
+        </w:rPr>
+      </w:pPr>
+      <w:r>
+        <w:rPr>
           <w:rFonts w:eastAsia="黑体" w:hint="eastAsia"/>
           <w:sz w:val="44"/>
           <w:szCs w:val="44"/>
         </w:rPr>
-      </w:pPr>
+        <w:lastRenderedPageBreak/>
+        <w:t>摘</w:t>
+      </w:r>
       <w:r>
         <w:rPr>
           <w:rFonts w:eastAsia="黑体" w:hint="eastAsia"/>
           <w:sz w:val="44"/>
           <w:szCs w:val="44"/>
         </w:rPr>
-        <w:t>摘</w:t>
+        <w:t xml:space="preserve">  </w:t>
       </w:r>
       <w:r>
         <w:rPr>
@@ -5741,14 +5368,6 @@
           <w:sz w:val="44"/>
           <w:szCs w:val="44"/>
         </w:rPr>
-        <w:t xml:space="preserve">  </w:t>
-      </w:r>
-      <w:r>
-        <w:rPr>
-          <w:rFonts w:eastAsia="黑体" w:hint="eastAsia"/>
-          <w:sz w:val="44"/>
-          <w:szCs w:val="44"/>
-        </w:rPr>
         <w:t>要</w:t>
       </w:r>
     </w:p>
@@ -5773,7 +5392,6 @@
         <w:spacing w:line="440" w:lineRule="exact"/>
         <w:ind w:firstLineChars="200" w:firstLine="480"/>
         <w:rPr>
-          <w:rFonts w:hint="eastAsia"/>
           <w:sz w:val="24"/>
         </w:rPr>
       </w:pPr>
@@ -5785,36 +5403,12 @@
         <w:t>然而由于自然语言的复杂性，直至今天机器翻译的研究仍面临着巨大的困难。除词汇歧义和转换变异映射外，结构歧义一直是机器翻译研究中的主要困难之一。这是因为，各种机器翻译方法，无论是基于知识的还是基于经验的，都或多或少地依赖于源语的结构标注信息来完成语言的转换生成过程。</w:t>
       </w:r>
     </w:p>
-    <w:p>
-      <w:pPr>
-        <w:spacing w:line="440" w:lineRule="exact"/>
-        <w:ind w:firstLineChars="200" w:firstLine="480"/>
-        <w:rPr>
-          <w:rFonts w:hint="eastAsia"/>
-          <w:sz w:val="24"/>
-        </w:rPr>
-      </w:pPr>
-      <w:r>
-        <w:rPr>
-          <w:rFonts w:hint="eastAsia"/>
-          <w:sz w:val="24"/>
-        </w:rPr>
-        <w:t>……………………………………………………………………………………………………………………………………………………………………………………………………………………………………………………………………………………………………………………………………………………………………………………………………………………………………………………………………………………………………………………………………………………………………………………………………………………………………………………………………………………………………………………………………………………………………………………………………。</w:t>
-      </w:r>
-    </w:p>
-    <w:p>
-      <w:pPr>
-        <w:rPr>
-          <w:rFonts w:hint="eastAsia"/>
-        </w:rPr>
-      </w:pPr>
-    </w:p>
+    <w:p/>
     <w:p>
       <w:pPr>
         <w:spacing w:line="440" w:lineRule="exact"/>
         <w:ind w:left="960" w:hangingChars="400" w:hanging="960"/>
         <w:rPr>
-          <w:rFonts w:hint="eastAsia"/>
           <w:sz w:val="24"/>
         </w:rPr>
       </w:pPr>
@@ -5838,7 +5432,6 @@
         <w:spacing w:line="440" w:lineRule="exact"/>
         <w:ind w:left="960" w:hangingChars="400" w:hanging="960"/>
         <w:rPr>
-          <w:rFonts w:hint="eastAsia"/>
           <w:sz w:val="24"/>
         </w:rPr>
         <w:sectPr>
@@ -5875,6 +5468,7 @@
           <w:sz w:val="44"/>
           <w:szCs w:val="44"/>
         </w:rPr>
+        <w:lastRenderedPageBreak/>
         <w:t>Abstract</w:t>
       </w:r>
       <w:bookmarkEnd w:id="17"/>
@@ -5909,30 +5503,6 @@
           <w:sz w:val="24"/>
         </w:rPr>
         <w:t>However, due to the inherent complexity of the natural language, machine translation is still a great challenge until now. Apart from the word sense ambiguity and transformation divergence between languages, structural ambiguity is another main obstacle confronting the researchers. The reason is that almost all MT systems rely on the structurl annothation information to accomplish the language transformation, no matter they are knowledge based or experience based.</w:t>
-      </w:r>
-    </w:p>
-    <w:p>
-      <w:pPr>
-        <w:spacing w:line="440" w:lineRule="exact"/>
-        <w:ind w:firstLineChars="200" w:firstLine="480"/>
-        <w:rPr>
-          <w:rFonts w:hint="eastAsia"/>
-          <w:sz w:val="24"/>
-        </w:rPr>
-      </w:pPr>
-      <w:r>
-        <w:rPr>
-          <w:rFonts w:hint="eastAsia"/>
-          <w:sz w:val="24"/>
-        </w:rPr>
-        <w:t>………………………………………………………………………………………………………………………………………………………………………………………………………………………………………………………………………………………………</w:t>
-      </w:r>
-      <w:r>
-        <w:rPr>
-          <w:rFonts w:hint="eastAsia"/>
-          <w:sz w:val="24"/>
-        </w:rPr>
-        <w:t>.</w:t>
       </w:r>
     </w:p>
     <w:p>
@@ -5992,18 +5562,27 @@
         <w:spacing w:beforeLines="100" w:before="312" w:afterLines="100" w:after="312"/>
         <w:jc w:val="center"/>
         <w:rPr>
+          <w:rFonts w:eastAsia="黑体"/>
+          <w:sz w:val="44"/>
+          <w:szCs w:val="44"/>
+        </w:rPr>
+      </w:pPr>
+      <w:r>
+        <w:rPr>
           <w:rFonts w:eastAsia="黑体" w:hint="eastAsia"/>
           <w:sz w:val="44"/>
           <w:szCs w:val="44"/>
         </w:rPr>
-      </w:pPr>
+        <w:lastRenderedPageBreak/>
+        <w:t>目</w:t>
+      </w:r>
       <w:r>
         <w:rPr>
           <w:rFonts w:eastAsia="黑体" w:hint="eastAsia"/>
           <w:sz w:val="44"/>
           <w:szCs w:val="44"/>
         </w:rPr>
-        <w:t>目</w:t>
+        <w:t xml:space="preserve">  </w:t>
       </w:r>
       <w:r>
         <w:rPr>
@@ -6011,14 +5590,6 @@
           <w:sz w:val="44"/>
           <w:szCs w:val="44"/>
         </w:rPr>
-        <w:t xml:space="preserve">  </w:t>
-      </w:r>
-      <w:r>
-        <w:rPr>
-          <w:rFonts w:eastAsia="黑体" w:hint="eastAsia"/>
-          <w:sz w:val="44"/>
-          <w:szCs w:val="44"/>
-        </w:rPr>
         <w:t>录</w:t>
       </w:r>
     </w:p>
@@ -6026,9 +5597,6 @@
       <w:pPr>
         <w:spacing w:line="360" w:lineRule="auto"/>
         <w:jc w:val="distribute"/>
-        <w:rPr>
-          <w:rFonts w:hint="eastAsia"/>
-        </w:rPr>
       </w:pPr>
       <w:r>
         <w:rPr>
@@ -6062,9 +5630,6 @@
       <w:pPr>
         <w:spacing w:line="360" w:lineRule="auto"/>
         <w:jc w:val="distribute"/>
-        <w:rPr>
-          <w:rFonts w:hint="eastAsia"/>
-        </w:rPr>
       </w:pPr>
       <w:r>
         <w:rPr>
@@ -6088,9 +5653,6 @@
     <w:p>
       <w:pPr>
         <w:spacing w:line="360" w:lineRule="auto"/>
-        <w:rPr>
-          <w:rFonts w:hint="eastAsia"/>
-        </w:rPr>
       </w:pPr>
       <w:r>
         <w:rPr>
@@ -6522,9 +6084,6 @@
       <w:pPr>
         <w:spacing w:line="360" w:lineRule="auto"/>
         <w:jc w:val="distribute"/>
-        <w:rPr>
-          <w:rFonts w:hint="eastAsia"/>
-        </w:rPr>
       </w:pPr>
       <w:r>
         <w:rPr>
@@ -6905,9 +6464,6 @@
     <w:p>
       <w:pPr>
         <w:spacing w:line="360" w:lineRule="auto"/>
-        <w:rPr>
-          <w:rFonts w:hint="eastAsia"/>
-        </w:rPr>
       </w:pPr>
       <w:r>
         <w:rPr>
@@ -6922,13 +6478,7 @@
         <w:t>………………………………………………………………</w:t>
       </w:r>
     </w:p>
-    <w:p>
-      <w:pPr>
-        <w:rPr>
-          <w:rFonts w:hint="eastAsia"/>
-        </w:rPr>
-      </w:pPr>
-    </w:p>
+    <w:p/>
     <w:p>
       <w:pPr>
         <w:sectPr>
@@ -6946,35 +6496,44 @@
         <w:spacing w:beforeLines="100" w:before="312" w:afterLines="100" w:after="312"/>
         <w:jc w:val="center"/>
         <w:rPr>
+          <w:rFonts w:ascii="黑体" w:eastAsia="黑体"/>
+          <w:sz w:val="44"/>
+          <w:szCs w:val="44"/>
+        </w:rPr>
+      </w:pPr>
+      <w:r>
+        <w:rPr>
           <w:rFonts w:ascii="黑体" w:eastAsia="黑体" w:hint="eastAsia"/>
           <w:sz w:val="44"/>
           <w:szCs w:val="44"/>
         </w:rPr>
-      </w:pPr>
+        <w:lastRenderedPageBreak/>
+        <w:t xml:space="preserve">第1章 </w:t>
+      </w:r>
       <w:r>
         <w:rPr>
           <w:rFonts w:ascii="黑体" w:eastAsia="黑体" w:hint="eastAsia"/>
           <w:sz w:val="44"/>
           <w:szCs w:val="44"/>
         </w:rPr>
-        <w:t>第1章 引 言</w:t>
+        <w:t>绪 论</w:t>
       </w:r>
     </w:p>
     <w:p>
       <w:pPr>
         <w:spacing w:beforeLines="50" w:before="156" w:afterLines="50" w:after="156"/>
+        <w:rPr>
+          <w:rFonts w:ascii="黑体" w:eastAsia="黑体"/>
+          <w:sz w:val="32"/>
+          <w:szCs w:val="32"/>
+        </w:rPr>
+      </w:pPr>
+      <w:r>
         <w:rPr>
           <w:rFonts w:ascii="黑体" w:eastAsia="黑体" w:hint="eastAsia"/>
           <w:sz w:val="32"/>
           <w:szCs w:val="32"/>
         </w:rPr>
-      </w:pPr>
-      <w:r>
-        <w:rPr>
-          <w:rFonts w:ascii="黑体" w:eastAsia="黑体" w:hint="eastAsia"/>
-          <w:sz w:val="32"/>
-          <w:szCs w:val="32"/>
-        </w:rPr>
         <w:t>1.1 研究背景</w:t>
       </w:r>
     </w:p>
@@ -7027,38 +6586,21 @@
     </w:p>
     <w:p>
       <w:pPr>
-        <w:spacing w:line="440" w:lineRule="exact"/>
-        <w:ind w:firstLineChars="200" w:firstLine="480"/>
-        <w:rPr>
-          <w:rFonts w:ascii="宋体" w:hAnsi="宋体" w:hint="eastAsia"/>
-          <w:sz w:val="24"/>
-        </w:rPr>
-      </w:pPr>
-      <w:r>
-        <w:rPr>
-          <w:rFonts w:ascii="宋体" w:hAnsi="宋体" w:hint="eastAsia"/>
-          <w:sz w:val="24"/>
-        </w:rPr>
-        <w:t>…………………………………………………………………………………………………………。</w:t>
-      </w:r>
-    </w:p>
-    <w:p>
-      <w:pPr>
         <w:spacing w:beforeLines="50" w:before="156" w:afterLines="50" w:after="156"/>
+        <w:rPr>
+          <w:rFonts w:ascii="黑体" w:eastAsia="黑体"/>
+          <w:bCs/>
+          <w:sz w:val="28"/>
+          <w:szCs w:val="28"/>
+        </w:rPr>
+      </w:pPr>
+      <w:r>
         <w:rPr>
           <w:rFonts w:ascii="黑体" w:eastAsia="黑体" w:hint="eastAsia"/>
           <w:bCs/>
           <w:sz w:val="28"/>
           <w:szCs w:val="28"/>
         </w:rPr>
-      </w:pPr>
-      <w:r>
-        <w:rPr>
-          <w:rFonts w:ascii="黑体" w:eastAsia="黑体" w:hint="eastAsia"/>
-          <w:bCs/>
-          <w:sz w:val="28"/>
-          <w:szCs w:val="28"/>
-        </w:rPr>
         <w:t xml:space="preserve">1.1.1 结构歧义 </w:t>
       </w:r>
     </w:p>
@@ -7079,43 +6621,9 @@
         <w:t>然而与形式语言的分析相比，应用计算机进行自然语言的结构分析却远非一件容易的工作。</w:t>
       </w:r>
     </w:p>
-    <w:p>
-      <w:pPr>
-        <w:spacing w:line="440" w:lineRule="exact"/>
-        <w:ind w:firstLineChars="200" w:firstLine="480"/>
-        <w:rPr>
-          <w:rFonts w:hint="eastAsia"/>
-        </w:rPr>
-      </w:pPr>
-      <w:r>
-        <w:rPr>
-          <w:rFonts w:ascii="宋体" w:hAnsi="宋体" w:hint="eastAsia"/>
-          <w:sz w:val="24"/>
-        </w:rPr>
-        <w:t>……………………………………………………………………………………。</w:t>
-      </w:r>
-    </w:p>
-    <w:p>
-      <w:pPr>
-        <w:rPr>
-          <w:rFonts w:hint="eastAsia"/>
-        </w:rPr>
-      </w:pPr>
-    </w:p>
-    <w:p>
-      <w:pPr>
-        <w:rPr>
-          <w:rFonts w:hint="eastAsia"/>
-        </w:rPr>
-      </w:pPr>
-    </w:p>
-    <w:p>
-      <w:pPr>
-        <w:rPr>
-          <w:rFonts w:hint="eastAsia"/>
-        </w:rPr>
-      </w:pPr>
-    </w:p>
+    <w:p/>
+    <w:p/>
+    <w:p/>
     <w:sectPr>
       <w:headerReference w:type="default" r:id="rId17"/>
       <w:pgSz w:w="11906" w:h="16838"/>
@@ -7170,9 +6678,6 @@
   <w:p>
     <w:pPr>
       <w:pStyle w:val="a7"/>
-      <w:rPr>
-        <w:rFonts w:hint="eastAsia"/>
-      </w:rPr>
     </w:pPr>
     <w:r>
       <w:rPr>
@@ -7265,11 +6770,54 @@
     <w:lsdException w:name="Emphasis" w:qFormat="1"/>
     <w:lsdException w:name="HTML Top of Form" w:semiHidden="1" w:uiPriority="99" w:unhideWhenUsed="1"/>
     <w:lsdException w:name="HTML Bottom of Form" w:semiHidden="1" w:uiPriority="99" w:unhideWhenUsed="1"/>
-    <w:lsdException w:name="Normal Table" w:semiHidden="1"/>
+    <w:lsdException w:name="Normal Table" w:semiHidden="1" w:unhideWhenUsed="1"/>
     <w:lsdException w:name="No List" w:semiHidden="1" w:uiPriority="99" w:unhideWhenUsed="1"/>
     <w:lsdException w:name="Outline List 1" w:semiHidden="1" w:uiPriority="99" w:unhideWhenUsed="1"/>
     <w:lsdException w:name="Outline List 2" w:semiHidden="1" w:uiPriority="99" w:unhideWhenUsed="1"/>
     <w:lsdException w:name="Outline List 3" w:semiHidden="1" w:uiPriority="99" w:unhideWhenUsed="1"/>
+    <w:lsdException w:name="Table Simple 1" w:semiHidden="1" w:unhideWhenUsed="1"/>
+    <w:lsdException w:name="Table Simple 2" w:semiHidden="1" w:unhideWhenUsed="1"/>
+    <w:lsdException w:name="Table Simple 3" w:semiHidden="1" w:unhideWhenUsed="1"/>
+    <w:lsdException w:name="Table Classic 1" w:semiHidden="1" w:unhideWhenUsed="1"/>
+    <w:lsdException w:name="Table Classic 2" w:semiHidden="1" w:unhideWhenUsed="1"/>
+    <w:lsdException w:name="Table Classic 3" w:semiHidden="1" w:unhideWhenUsed="1"/>
+    <w:lsdException w:name="Table Classic 4" w:semiHidden="1" w:unhideWhenUsed="1"/>
+    <w:lsdException w:name="Table Colorful 1" w:semiHidden="1" w:unhideWhenUsed="1"/>
+    <w:lsdException w:name="Table Colorful 2" w:semiHidden="1" w:unhideWhenUsed="1"/>
+    <w:lsdException w:name="Table Colorful 3" w:semiHidden="1" w:unhideWhenUsed="1"/>
+    <w:lsdException w:name="Table Columns 1" w:semiHidden="1" w:unhideWhenUsed="1"/>
+    <w:lsdException w:name="Table Columns 2" w:semiHidden="1" w:unhideWhenUsed="1"/>
+    <w:lsdException w:name="Table Columns 3" w:semiHidden="1" w:unhideWhenUsed="1"/>
+    <w:lsdException w:name="Table Columns 4" w:semiHidden="1" w:unhideWhenUsed="1"/>
+    <w:lsdException w:name="Table Columns 5" w:semiHidden="1" w:unhideWhenUsed="1"/>
+    <w:lsdException w:name="Table Grid 1" w:semiHidden="1" w:unhideWhenUsed="1"/>
+    <w:lsdException w:name="Table Grid 2" w:semiHidden="1" w:unhideWhenUsed="1"/>
+    <w:lsdException w:name="Table Grid 3" w:semiHidden="1" w:unhideWhenUsed="1"/>
+    <w:lsdException w:name="Table Grid 4" w:semiHidden="1" w:unhideWhenUsed="1"/>
+    <w:lsdException w:name="Table Grid 5" w:semiHidden="1" w:unhideWhenUsed="1"/>
+    <w:lsdException w:name="Table Grid 6" w:semiHidden="1" w:unhideWhenUsed="1"/>
+    <w:lsdException w:name="Table Grid 7" w:semiHidden="1" w:unhideWhenUsed="1"/>
+    <w:lsdException w:name="Table Grid 8" w:semiHidden="1" w:unhideWhenUsed="1"/>
+    <w:lsdException w:name="Table List 1" w:semiHidden="1" w:unhideWhenUsed="1"/>
+    <w:lsdException w:name="Table List 2" w:semiHidden="1" w:unhideWhenUsed="1"/>
+    <w:lsdException w:name="Table List 3" w:semiHidden="1" w:unhideWhenUsed="1"/>
+    <w:lsdException w:name="Table List 4" w:semiHidden="1" w:unhideWhenUsed="1"/>
+    <w:lsdException w:name="Table List 5" w:semiHidden="1" w:unhideWhenUsed="1"/>
+    <w:lsdException w:name="Table List 6" w:semiHidden="1" w:unhideWhenUsed="1"/>
+    <w:lsdException w:name="Table List 7" w:semiHidden="1" w:unhideWhenUsed="1"/>
+    <w:lsdException w:name="Table List 8" w:semiHidden="1" w:unhideWhenUsed="1"/>
+    <w:lsdException w:name="Table 3D effects 1" w:semiHidden="1" w:unhideWhenUsed="1"/>
+    <w:lsdException w:name="Table 3D effects 2" w:semiHidden="1" w:unhideWhenUsed="1"/>
+    <w:lsdException w:name="Table 3D effects 3" w:semiHidden="1" w:unhideWhenUsed="1"/>
+    <w:lsdException w:name="Table Contemporary" w:semiHidden="1" w:unhideWhenUsed="1"/>
+    <w:lsdException w:name="Table Elegant" w:semiHidden="1" w:unhideWhenUsed="1"/>
+    <w:lsdException w:name="Table Professional" w:semiHidden="1" w:unhideWhenUsed="1"/>
+    <w:lsdException w:name="Table Subtle 1" w:semiHidden="1" w:unhideWhenUsed="1"/>
+    <w:lsdException w:name="Table Subtle 2" w:semiHidden="1" w:unhideWhenUsed="1"/>
+    <w:lsdException w:name="Table Web 1" w:semiHidden="1" w:unhideWhenUsed="1"/>
+    <w:lsdException w:name="Table Web 2" w:semiHidden="1" w:unhideWhenUsed="1"/>
+    <w:lsdException w:name="Table Web 3" w:semiHidden="1" w:unhideWhenUsed="1"/>
+    <w:lsdException w:name="Table Theme" w:semiHidden="1" w:unhideWhenUsed="1"/>
     <w:lsdException w:name="Placeholder Text" w:semiHidden="1" w:uiPriority="99" w:unhideWhenUsed="1"/>
     <w:lsdException w:name="No Spacing" w:uiPriority="99" w:qFormat="1"/>
     <w:lsdException w:name="Light Shading" w:uiPriority="60"/>
@@ -7554,12 +7102,17 @@
   </w:style>
   <w:style w:type="character" w:default="1" w:styleId="a0">
     <w:name w:val="Default Paragraph Font"/>
+    <w:uiPriority w:val="1"/>
     <w:semiHidden/>
+    <w:unhideWhenUsed/>
   </w:style>
   <w:style w:type="table" w:default="1" w:styleId="a1">
     <w:name w:val="Normal Table"/>
+    <w:uiPriority w:val="99"/>
     <w:semiHidden/>
+    <w:unhideWhenUsed/>
     <w:tblPr>
+      <w:tblInd w:w="0" w:type="dxa"/>
       <w:tblCellMar>
         <w:top w:w="0" w:type="dxa"/>
         <w:left w:w="108" w:type="dxa"/>

</xml_diff>